<commit_message>
CA2 report: orange proofreading pass over all chapters
98 verified fixes (grammar, Australian spelling, punctuation, cross-references,
terminology, stray editorial marker, two algorithm headings, a lost equation in
7.9, two reference typos). REVIEW_v4 shows them in orange; FINAL is clean.

Co-Authored-By: Claude Fable 5.1 <noreply@anthropic.com>
Claude-Session: https://claude.ai/code/session_017h1Gwx95j2svhJWPEddHRu
</commit_message>
<xml_diff>
--- a/review/word/Yasir_CA2_Report_FINAL.docx
+++ b/review/word/Yasir_CA2_Report_FINAL.docx
@@ -110,7 +110,7 @@
         <w:pStyle w:val="BodyText"/>
       </w:pPr>
       <w:r>
-        <w:t xml:space="preserve">Healthcare represents a particularly important and challenging example of this broader problem. The increasing digitisation and decentralisation of healthcare information enables patients, healthcare professionals, guardians, researchers, healthcare organisations, and other authorised entities to participate in data-sharing processes [16, 32, 35]. At the same time, healthcare data is highly sensitive, heterogeneous, and often subject to strict privacy, ethical, and governance requirements. Its exchange therefore raises complex questions concerning identity, authority, patient consent, privacy protection, accountability, and fine-grained access control [14, 21, 23].</w:t>
+        <w:t xml:space="preserve">Healthcare represents a particularly important and challenging example of this broader problem. The increasing digitisation and decentralisation of healthcare information enable patients, healthcare professionals, guardians, researchers, healthcare organisations, and other authorised entities to participate in data-sharing processes [16, 32, 35]. At the same time, healthcare data is highly sensitive, heterogeneous, and often subject to strict privacy, ethical, and governance requirements. Its exchange therefore raises complex questions concerning identity, authority, patient consent, privacy protection, accountability, and fine-grained access control [14, 21, 23].</w:t>
       </w:r>
     </w:p>
     <w:p>
@@ -293,17 +293,7 @@
           <w:i/>
           <w:iCs/>
         </w:rPr>
-        <w:t xml:space="preserve">trustworthy</w:t>
-      </w:r>
-      <w:r>
-        <w:t xml:space="preserve"> </w:t>
-      </w:r>
-      <w:r>
-        <w:rPr>
-          <w:i/>
-          <w:iCs/>
-        </w:rPr>
-        <w:t xml:space="preserve">authorisation enforcement</w:t>
+        <w:t xml:space="preserve">trustworthy authorisation enforcement</w:t>
       </w:r>
       <w:r>
         <w:t xml:space="preserve">. A consent record can demonstrate that a decision has been created or recorded, but it does not necessarily establish why that decision should be trusted when it is subsequently exercised. Immutability protects the integrity of recorded information, but immutability alone does not verify the legitimacy of the entities that participated in the decision. Likewise, successful authentication establishes that an entity has been identified, but authentication does not automatically establish that the entity possesses the authority to access a particular patient’s information.</w:t>
@@ -580,7 +570,7 @@
               <w:jc w:val="left"/>
             </w:pPr>
             <w:r>
-              <w:t xml:space="preserve">RO1: Trust-Centric Consent Modelling</w:t>
+              <w:t xml:space="preserve">RO1: Trust-Centric Consent Model</w:t>
             </w:r>
           </w:p>
         </w:tc>
@@ -703,7 +693,7 @@
               <w:jc w:val="left"/>
             </w:pPr>
             <w:r>
-              <w:t xml:space="preserve">RO4: Policy- and Context-Aware Authorisation</w:t>
+              <w:t xml:space="preserve">RO4: Policy- and Context-Aware Access Control</w:t>
             </w:r>
           </w:p>
         </w:tc>
@@ -818,7 +808,7 @@
         <w:pStyle w:val="FirstParagraph"/>
       </w:pPr>
       <w:r>
-        <w:t xml:space="preserve">The remainder of this report is organised as follows. Chapter 2 presents the systematic literature review: it defines the five key requirements that a trust-oriented consent authorisation framework should satisfy, describes the four-step process used to shortlist the studies, summarises the shortlisted studies by category and identifies the research gaps from the requirement perspective. Chapter 3 states the research gap, the main research question and the six sub-research questions, and Chapter 4 translates them into six research objectives. Chapter 5 describes the MVC-based research architecture, and Chapter 6 presents the proposed solution for each objective through its workflow, procedure and algorithm. Chapter 7 presents the HALAH prototype, its four subsystems, the mapping to the source code, the automated test evidence and the on-chain evidence. Chapter 8 reports the progress of each objective, Chapter 9 summarises the publication plan and Chapter 10 sets out the research plan for the next stage.</w:t>
+        <w:t xml:space="preserve">The remainder of this report is organised as follows. Chapter 2 presents the systematic literature review: it defines the five key requirements that a trust-oriented consent authorisation framework should satisfy, describes the four-step process used to shortlist the studies, summarises the shortlisted studies by category and identifies the research gaps from the requirement perspective. Chapter 3 states the research gap, the main research question and the six sub-research questions, and Chapter 4 translates them into six research objectives. Chapter 5 describes the Model–View–Controller (MVC) research architecture, and Chapter 6 presents the proposed solution for each objective through its workflow, procedure and algorithm. Chapter 7 presents the HALAH prototype, its four subsystems, the mapping to the source code, the automated test evidence and the on-chain evidence. Chapter 8 reports the progress of each objective, Chapter 9 summarises the publication plan and Chapter 10 sets out the research plan for the next stage.</w:t>
       </w:r>
     </w:p>
     <w:bookmarkEnd w:id="12"/>
@@ -838,16 +828,7 @@
         <w:pStyle w:val="Heading2"/>
       </w:pPr>
       <w:r>
-        <w:t xml:space="preserve">2.1</w:t>
-      </w:r>
-      <w:r>
-        <w:t xml:space="preserve"> </w:t>
-      </w:r>
-      <w:r>
-        <w:t xml:space="preserve"> </w:t>
-      </w:r>
-      <w:r>
-        <w:t xml:space="preserve">Introduction</w:t>
+        <w:t xml:space="preserve">2.1 Introduction</w:t>
       </w:r>
     </w:p>
     <w:p>
@@ -879,7 +860,7 @@
         <w:pStyle w:val="BodyText"/>
       </w:pPr>
       <w:r>
-        <w:t xml:space="preserve">The reviewed studies were located, shortlisted and evaluated through the systematic process described in Section 2.3, which follows the four-step approach of searching the literature, applying inclusion and exclusion criteria, evaluating quality and analysing the data. To make the evaluation comparable across studies, Section 2.2 first defines five key requirements that a trust-oriented consent authorisation framework should satisfy. Each shortlisted paper is then assessed against these requirements in Section 2.4, the research gaps are drawn together from the requirement perspective in Section 2.5, and Section 2.6 concludes the chapter and introduces the research questions and objectives of Chapter 3.</w:t>
+        <w:t xml:space="preserve">The reviewed studies were located, shortlisted and evaluated through the systematic process described in Section 2.3, which follows the four-step approach of searching the literature, applying inclusion and exclusion criteria, evaluating quality and analysing the data. To make the evaluation comparable across studies, Section 2.2 first defines five key requirements that a trust-oriented consent authorisation framework should satisfy. Each shortlisted paper is then assessed against these requirements in Section 2.4, the research gaps are drawn together from the requirement perspective in Section 2.5, and Section 2.6 concludes the chapter and introduces the research questions and objectives of Chapters 3 and 4.</w:t>
       </w:r>
     </w:p>
     <w:bookmarkEnd w:id="14"/>
@@ -1069,19 +1050,7 @@
         <w:pStyle w:val="Heading2"/>
       </w:pPr>
       <w:r>
-        <w:t xml:space="preserve"> </w:t>
-      </w:r>
-      <w:r>
-        <w:t xml:space="preserve">2.3</w:t>
-      </w:r>
-      <w:r>
-        <w:t xml:space="preserve"> </w:t>
-      </w:r>
-      <w:r>
-        <w:t xml:space="preserve"> </w:t>
-      </w:r>
-      <w:r>
-        <w:t xml:space="preserve">Process Adopted for Shortlisting the Papers for the SLR</w:t>
+        <w:t xml:space="preserve">2.3 Process Adopted for Shortlisting the Papers for the SLR</w:t>
       </w:r>
     </w:p>
     <w:p>
@@ -1089,7 +1058,7 @@
         <w:pStyle w:val="FirstParagraph"/>
       </w:pPr>
       <w:r>
-        <w:t xml:space="preserve">This review followed the Preferred Reporting Items for Systematic Reviews and Meta-Analyses (PRISMA 2020) reporting guideline [40]. It covers peer-reviewed literature published between 2022 and 2026 on healthcare consent management, decentralised identity and verifiable credentials, multi-party authorisation and policy-aware access control. The review questions, search strategy, eligibility criteria, screening, data extraction and quality assessment are described in Sections 2.3.1–2.3.6, and the resulting study selection is summarised in Figure 2.2.Consistent with the four-step approach adopted in this research group, the process is reported as searching the literature (Step 1), applying inclusion and exclusion criteria (Step 2), evaluating quality (Step 3) and extracting and categorising the data (Step 4).</w:t>
+        <w:t xml:space="preserve">This review followed the Preferred Reporting Items for Systematic Reviews and Meta-Analyses (PRISMA 2020) reporting guideline [40]. It covers peer-reviewed literature published between 2022 and 2026 on healthcare consent management, decentralised identity and verifiable credentials, multi-party authorisation and policy-aware access control. The review questions, search strategy, eligibility criteria, screening, data extraction and quality assessment are described in Sections 2.3.1–2.3.6, and the resulting study selection is summarised in Figure 2.2. Consistent with the four-step approach adopted in this research group, the process is reported as searching the literature (Step 1), applying inclusion and exclusion criteria (Step 2), evaluating quality (Step 3) and extracting and categorising the data (Step 4).</w:t>
       </w:r>
     </w:p>
     <w:bookmarkStart w:id="21" w:name="review-design-and-reporting-framework"/>
@@ -1097,9 +1066,6 @@
       <w:pPr>
         <w:pStyle w:val="Heading3"/>
       </w:pPr>
-      <w:r>
-        <w:t xml:space="preserve"> </w:t>
-      </w:r>
       <w:r>
         <w:t xml:space="preserve">2.3.1 Review Design and Reporting Framework</w:t>
       </w:r>
@@ -1126,9 +1092,6 @@
       <w:pPr>
         <w:pStyle w:val="Heading3"/>
       </w:pPr>
-      <w:r>
-        <w:t xml:space="preserve"> </w:t>
-      </w:r>
       <w:r>
         <w:t xml:space="preserve">2.3.2 Questions for Review</w:t>
       </w:r>
@@ -1211,19 +1174,7 @@
         <w:pStyle w:val="Heading3"/>
       </w:pPr>
       <w:r>
-        <w:t xml:space="preserve"> </w:t>
-      </w:r>
-      <w:r>
-        <w:t xml:space="preserve">2.3.3</w:t>
-      </w:r>
-      <w:r>
-        <w:t xml:space="preserve"> </w:t>
-      </w:r>
-      <w:r>
-        <w:t xml:space="preserve"> </w:t>
-      </w:r>
-      <w:r>
-        <w:t xml:space="preserve">Step 1: Criteria for Searching the Literature</w:t>
+        <w:t xml:space="preserve">2.3.3 Step 1: Criteria for Searching the Literature</w:t>
       </w:r>
     </w:p>
     <w:p>
@@ -1351,7 +1302,7 @@
         <w:t xml:space="preserve">2026</w:t>
       </w:r>
       <w:r>
-        <w:t xml:space="preserve">. The search was performed in</w:t>
+        <w:t xml:space="preserve">. The search was performed on</w:t>
       </w:r>
       <w:r>
         <w:t xml:space="preserve"> </w:t>
@@ -1364,7 +1315,7 @@
         <w:t xml:space="preserve">15 August 2026</w:t>
       </w:r>
       <w:r>
-        <w:t xml:space="preserve">. The search period was selected to capture the rapid development of multi-party trust healthcare data management, decentralised identity, and consent-aware access control while maintaining a sufficiently contemporary evidence base. Earlier foundational studies were retained when they provided critical contributions to the technical or conceptual development of the reviewed approaches.</w:t>
+        <w:t xml:space="preserve">. The search period was selected to capture the rapid development of multi-party trust healthcare data management, decentralised identity, and consent-aware access control while maintaining a sufficiently contemporary evidence base.</w:t>
       </w:r>
     </w:p>
     <w:p>
@@ -1428,10 +1379,10 @@
         <w:tblCaption w:val="Table 2.1: Journals and conference proceedings of the included studies"/>
       </w:tblPr>
       <w:tblGrid>
-        <w:gridCol w:w="720"/>
-        <w:gridCol w:w="4464"/>
-        <w:gridCol w:w="1152"/>
-        <w:gridCol w:w="1584"/>
+        <w:gridCol w:w="990"/>
+        <w:gridCol w:w="4207"/>
+        <w:gridCol w:w="990"/>
+        <w:gridCol w:w="1732"/>
       </w:tblGrid>
       <w:tr>
         <w:trPr>
@@ -3072,19 +3023,7 @@
         <w:pStyle w:val="Heading3"/>
       </w:pPr>
       <w:r>
-        <w:t xml:space="preserve"> </w:t>
-      </w:r>
-      <w:r>
-        <w:t xml:space="preserve">2.3.4</w:t>
-      </w:r>
-      <w:r>
-        <w:t xml:space="preserve"> </w:t>
-      </w:r>
-      <w:r>
-        <w:t xml:space="preserve"> </w:t>
-      </w:r>
-      <w:r>
-        <w:t xml:space="preserve">Step 2: Inclusion and Exclusion Criteria</w:t>
+        <w:t xml:space="preserve">2.3.4 Step 2: Inclusion and Exclusion Criteria</w:t>
       </w:r>
     </w:p>
     <w:p>
@@ -3248,7 +3187,7 @@
         <w:pStyle w:val="FirstParagraph"/>
       </w:pPr>
       <w:r>
-        <w:t xml:space="preserve">Consistent with exclusion criterion 6, four studies from outside the healthcare domain were retained because the mechanism they contribute transfers directly to healthcare authorisation: decentralised trust in multi-stakeholder data sharing [1], DID/VC-based privacy-preserving authentication [26], and decentralised identity and access control for constrained devices [17, 18]. Studies whose subject matter lies outside healthcare data sharing, consent, identity or access control were excluded at the full-text stage as scope mismatches (Figure 2.2). One book chapter [18] was retained under the exception to exclusion criterion 3 because it provides a foundational overview of decentralised identity. The 2019 policy statement on guardian and proxy access [32] and two survey studies of stakeholder attitudes and intentions towards health-data sharing [14, 16] are cited as background in Chapter 1 but were not retained in the review set, because they fall outside the publication window or do not propose, implement or evaluate an approach (inclusion criterion 3).</w:t>
+        <w:t xml:space="preserve">Consistent with exclusion criterion 6, four studies from outside the healthcare domain were retained because the mechanism they contribute transfers directly to healthcare authorisation: decentralised trust in multi-stakeholder data sharing [1], privacy-preserving authentication based on decentralised identifiers and verifiable credentials [26], and decentralised identity and access control for constrained devices [17, 18]. Studies whose subject matter lies outside healthcare data sharing, consent, identity or access control were excluded at the full-text stage as scope mismatches (Figure 2.2). The 2019 policy statement on guardian and proxy access [32] and two survey studies of stakeholder attitudes and intentions towards health-data sharing [14, 16] are cited as background in Chapter 1 but were not retained in the review set, because they fall outside the publication window or do not propose, implement or evaluate an approach (inclusion criterion 3).</w:t>
       </w:r>
     </w:p>
     <w:p>
@@ -3284,10 +3223,10 @@
         <w:tblCaption w:val="Table 2.2: Summary of the stages of evaluating and selecting the relevant papers for the SLR"/>
       </w:tblPr>
       <w:tblGrid>
-        <w:gridCol w:w="371"/>
-        <w:gridCol w:w="2598"/>
-        <w:gridCol w:w="3836"/>
-        <w:gridCol w:w="1113"/>
+        <w:gridCol w:w="664"/>
+        <w:gridCol w:w="2824"/>
+        <w:gridCol w:w="2824"/>
+        <w:gridCol w:w="1606"/>
       </w:tblGrid>
       <w:tr>
         <w:trPr>
@@ -3656,19 +3595,7 @@
         <w:pStyle w:val="Heading3"/>
       </w:pPr>
       <w:r>
-        <w:t xml:space="preserve"> </w:t>
-      </w:r>
-      <w:r>
-        <w:t xml:space="preserve">2.3.5</w:t>
-      </w:r>
-      <w:r>
-        <w:t xml:space="preserve"> </w:t>
-      </w:r>
-      <w:r>
-        <w:t xml:space="preserve"> </w:t>
-      </w:r>
-      <w:r>
-        <w:t xml:space="preserve">Step 3: Screening and Quality Evaluation</w:t>
+        <w:t xml:space="preserve">2.3.5 Step 3: Screening and Quality Evaluation</w:t>
       </w:r>
     </w:p>
     <w:p>
@@ -3785,19 +3712,7 @@
         <w:pStyle w:val="Heading3"/>
       </w:pPr>
       <w:r>
-        <w:t xml:space="preserve"> </w:t>
-      </w:r>
-      <w:r>
-        <w:t xml:space="preserve">2.3.6</w:t>
-      </w:r>
-      <w:r>
-        <w:t xml:space="preserve"> </w:t>
-      </w:r>
-      <w:r>
-        <w:t xml:space="preserve"> </w:t>
-      </w:r>
-      <w:r>
-        <w:t xml:space="preserve">Step 4: Data Extraction and Categorisation of the Shortlisted Papers</w:t>
+        <w:t xml:space="preserve">2.3.6 Step 4: Data Extraction and Categorisation of the Shortlisted Papers</w:t>
       </w:r>
     </w:p>
     <w:p>
@@ -3829,7 +3744,7 @@
         <w:pStyle w:val="BodyText"/>
       </w:pPr>
       <w:r>
-        <w:t xml:space="preserve">The final review set was used to establish the state of the art in multi-party-trust healthcare data sharing and consent management. The findings were subsequently used to identify research gaps and to inform the design requirements of the proposed framework.</w:t>
+        <w:t xml:space="preserve">The final review set was used to establish the state of the art in multi-party trust healthcare data sharing and consent management. The findings were subsequently used to identify research gaps and to inform the design requirements of the proposed framework.</w:t>
       </w:r>
     </w:p>
     <w:p>
@@ -3857,10 +3772,10 @@
         <w:tblCaption w:val="Table 2.3: Listing of the papers identified after shortlisting in the SLR process"/>
       </w:tblPr>
       <w:tblGrid>
-        <w:gridCol w:w="766"/>
-        <w:gridCol w:w="1660"/>
-        <w:gridCol w:w="3704"/>
-        <w:gridCol w:w="1788"/>
+        <w:gridCol w:w="642"/>
+        <w:gridCol w:w="1872"/>
+        <w:gridCol w:w="2729"/>
+        <w:gridCol w:w="2675"/>
       </w:tblGrid>
       <w:tr>
         <w:trPr>
@@ -5714,19 +5629,7 @@
         <w:pStyle w:val="Heading2"/>
       </w:pPr>
       <w:r>
-        <w:t xml:space="preserve"> </w:t>
-      </w:r>
-      <w:r>
-        <w:t xml:space="preserve">2.4</w:t>
-      </w:r>
-      <w:r>
-        <w:t xml:space="preserve"> </w:t>
-      </w:r>
-      <w:r>
-        <w:t xml:space="preserve"> </w:t>
-      </w:r>
-      <w:r>
-        <w:t xml:space="preserve">Summary of Papers Shortlisted in the SLR</w:t>
+        <w:t xml:space="preserve">2.4 Summary of Papers Shortlisted in the SLR</w:t>
       </w:r>
     </w:p>
     <w:p>
@@ -5743,19 +5646,7 @@
         <w:pStyle w:val="Heading3"/>
       </w:pPr>
       <w:r>
-        <w:t xml:space="preserve"> </w:t>
-      </w:r>
-      <w:r>
-        <w:t xml:space="preserve">2.4.1</w:t>
-      </w:r>
-      <w:r>
-        <w:t xml:space="preserve"> </w:t>
-      </w:r>
-      <w:r>
-        <w:t xml:space="preserve"> </w:t>
-      </w:r>
-      <w:r>
-        <w:t xml:space="preserve">Healthcare Consent and Privacy Governance</w:t>
+        <w:t xml:space="preserve">2.4.1 Healthcare Consent and Privacy Governance</w:t>
       </w:r>
     </w:p>
     <w:p>
@@ -5831,14 +5722,14 @@
         <w:tblCaption w:val="Table 2.4: Descriptions, issues and limitations of the studies on healthcare consent and privacy governance and their coverage of the key requirements"/>
       </w:tblPr>
       <w:tblGrid>
-        <w:gridCol w:w="728"/>
-        <w:gridCol w:w="2457"/>
-        <w:gridCol w:w="2457"/>
-        <w:gridCol w:w="455"/>
-        <w:gridCol w:w="455"/>
-        <w:gridCol w:w="455"/>
-        <w:gridCol w:w="455"/>
-        <w:gridCol w:w="455"/>
+        <w:gridCol w:w="546"/>
+        <w:gridCol w:w="2321"/>
+        <w:gridCol w:w="2321"/>
+        <w:gridCol w:w="546"/>
+        <w:gridCol w:w="546"/>
+        <w:gridCol w:w="546"/>
+        <w:gridCol w:w="546"/>
+        <w:gridCol w:w="546"/>
       </w:tblGrid>
       <w:tr>
         <w:trPr>
@@ -5922,7 +5813,7 @@
           <w:p>
             <w:pPr>
               <w:pStyle w:val="Compact"/>
-              <w:jc w:val="center"/>
+              <w:jc w:val="left"/>
             </w:pPr>
             <w:r>
               <w:rPr>
@@ -5944,7 +5835,7 @@
           <w:p>
             <w:pPr>
               <w:pStyle w:val="Compact"/>
-              <w:jc w:val="center"/>
+              <w:jc w:val="left"/>
             </w:pPr>
             <w:r>
               <w:rPr>
@@ -5966,7 +5857,7 @@
           <w:p>
             <w:pPr>
               <w:pStyle w:val="Compact"/>
-              <w:jc w:val="center"/>
+              <w:jc w:val="left"/>
             </w:pPr>
             <w:r>
               <w:rPr>
@@ -5988,7 +5879,7 @@
           <w:p>
             <w:pPr>
               <w:pStyle w:val="Compact"/>
-              <w:jc w:val="center"/>
+              <w:jc w:val="left"/>
             </w:pPr>
             <w:r>
               <w:rPr>
@@ -6010,7 +5901,7 @@
           <w:p>
             <w:pPr>
               <w:pStyle w:val="Compact"/>
-              <w:jc w:val="center"/>
+              <w:jc w:val="left"/>
             </w:pPr>
             <w:r>
               <w:rPr>
@@ -6067,7 +5958,7 @@
           <w:p>
             <w:pPr>
               <w:pStyle w:val="Compact"/>
-              <w:jc w:val="center"/>
+              <w:jc w:val="left"/>
             </w:pPr>
             <w:r>
               <w:t xml:space="preserve">×</w:t>
@@ -6079,7 +5970,7 @@
           <w:p>
             <w:pPr>
               <w:pStyle w:val="Compact"/>
-              <w:jc w:val="center"/>
+              <w:jc w:val="left"/>
             </w:pPr>
             <w:r>
               <w:t xml:space="preserve">×</w:t>
@@ -6091,7 +5982,7 @@
           <w:p>
             <w:pPr>
               <w:pStyle w:val="Compact"/>
-              <w:jc w:val="center"/>
+              <w:jc w:val="left"/>
             </w:pPr>
             <w:r>
               <w:t xml:space="preserve">×</w:t>
@@ -6103,7 +5994,7 @@
           <w:p>
             <w:pPr>
               <w:pStyle w:val="Compact"/>
-              <w:jc w:val="center"/>
+              <w:jc w:val="left"/>
             </w:pPr>
             <w:r>
               <w:t xml:space="preserve">×</w:t>
@@ -6115,7 +6006,7 @@
           <w:p>
             <w:pPr>
               <w:pStyle w:val="Compact"/>
-              <w:jc w:val="center"/>
+              <w:jc w:val="left"/>
             </w:pPr>
             <w:r>
               <w:t xml:space="preserve">×</w:t>
@@ -6168,7 +6059,7 @@
           <w:p>
             <w:pPr>
               <w:pStyle w:val="Compact"/>
-              <w:jc w:val="center"/>
+              <w:jc w:val="left"/>
             </w:pPr>
             <w:r>
               <w:t xml:space="preserve">√</w:t>
@@ -6180,7 +6071,7 @@
           <w:p>
             <w:pPr>
               <w:pStyle w:val="Compact"/>
-              <w:jc w:val="center"/>
+              <w:jc w:val="left"/>
             </w:pPr>
             <w:r>
               <w:t xml:space="preserve">×</w:t>
@@ -6192,7 +6083,7 @@
           <w:p>
             <w:pPr>
               <w:pStyle w:val="Compact"/>
-              <w:jc w:val="center"/>
+              <w:jc w:val="left"/>
             </w:pPr>
             <w:r>
               <w:t xml:space="preserve">×</w:t>
@@ -6204,7 +6095,7 @@
           <w:p>
             <w:pPr>
               <w:pStyle w:val="Compact"/>
-              <w:jc w:val="center"/>
+              <w:jc w:val="left"/>
             </w:pPr>
             <w:r>
               <w:t xml:space="preserve">×</w:t>
@@ -6216,7 +6107,7 @@
           <w:p>
             <w:pPr>
               <w:pStyle w:val="Compact"/>
-              <w:jc w:val="center"/>
+              <w:jc w:val="left"/>
             </w:pPr>
             <w:r>
               <w:t xml:space="preserve">√</w:t>
@@ -6269,7 +6160,7 @@
           <w:p>
             <w:pPr>
               <w:pStyle w:val="Compact"/>
-              <w:jc w:val="center"/>
+              <w:jc w:val="left"/>
             </w:pPr>
             <w:r>
               <w:t xml:space="preserve">√</w:t>
@@ -6281,7 +6172,7 @@
           <w:p>
             <w:pPr>
               <w:pStyle w:val="Compact"/>
-              <w:jc w:val="center"/>
+              <w:jc w:val="left"/>
             </w:pPr>
             <w:r>
               <w:t xml:space="preserve">×</w:t>
@@ -6293,7 +6184,7 @@
           <w:p>
             <w:pPr>
               <w:pStyle w:val="Compact"/>
-              <w:jc w:val="center"/>
+              <w:jc w:val="left"/>
             </w:pPr>
             <w:r>
               <w:t xml:space="preserve">×</w:t>
@@ -6305,7 +6196,7 @@
           <w:p>
             <w:pPr>
               <w:pStyle w:val="Compact"/>
-              <w:jc w:val="center"/>
+              <w:jc w:val="left"/>
             </w:pPr>
             <w:r>
               <w:t xml:space="preserve">×</w:t>
@@ -6317,7 +6208,7 @@
           <w:p>
             <w:pPr>
               <w:pStyle w:val="Compact"/>
-              <w:jc w:val="center"/>
+              <w:jc w:val="left"/>
             </w:pPr>
             <w:r>
               <w:t xml:space="preserve">√</w:t>
@@ -6370,7 +6261,7 @@
           <w:p>
             <w:pPr>
               <w:pStyle w:val="Compact"/>
-              <w:jc w:val="center"/>
+              <w:jc w:val="left"/>
             </w:pPr>
             <w:r>
               <w:t xml:space="preserve">√</w:t>
@@ -6382,7 +6273,7 @@
           <w:p>
             <w:pPr>
               <w:pStyle w:val="Compact"/>
-              <w:jc w:val="center"/>
+              <w:jc w:val="left"/>
             </w:pPr>
             <w:r>
               <w:t xml:space="preserve">×</w:t>
@@ -6394,7 +6285,7 @@
           <w:p>
             <w:pPr>
               <w:pStyle w:val="Compact"/>
-              <w:jc w:val="center"/>
+              <w:jc w:val="left"/>
             </w:pPr>
             <w:r>
               <w:t xml:space="preserve">×</w:t>
@@ -6406,7 +6297,7 @@
           <w:p>
             <w:pPr>
               <w:pStyle w:val="Compact"/>
-              <w:jc w:val="center"/>
+              <w:jc w:val="left"/>
             </w:pPr>
             <w:r>
               <w:t xml:space="preserve">×</w:t>
@@ -6418,7 +6309,7 @@
           <w:p>
             <w:pPr>
               <w:pStyle w:val="Compact"/>
-              <w:jc w:val="center"/>
+              <w:jc w:val="left"/>
             </w:pPr>
             <w:r>
               <w:t xml:space="preserve">×</w:t>
@@ -6471,7 +6362,7 @@
           <w:p>
             <w:pPr>
               <w:pStyle w:val="Compact"/>
-              <w:jc w:val="center"/>
+              <w:jc w:val="left"/>
             </w:pPr>
             <w:r>
               <w:t xml:space="preserve">√</w:t>
@@ -6483,7 +6374,7 @@
           <w:p>
             <w:pPr>
               <w:pStyle w:val="Compact"/>
-              <w:jc w:val="center"/>
+              <w:jc w:val="left"/>
             </w:pPr>
             <w:r>
               <w:t xml:space="preserve">×</w:t>
@@ -6495,7 +6386,7 @@
           <w:p>
             <w:pPr>
               <w:pStyle w:val="Compact"/>
-              <w:jc w:val="center"/>
+              <w:jc w:val="left"/>
             </w:pPr>
             <w:r>
               <w:t xml:space="preserve">×</w:t>
@@ -6507,7 +6398,7 @@
           <w:p>
             <w:pPr>
               <w:pStyle w:val="Compact"/>
-              <w:jc w:val="center"/>
+              <w:jc w:val="left"/>
             </w:pPr>
             <w:r>
               <w:t xml:space="preserve">×</w:t>
@@ -6519,7 +6410,7 @@
           <w:p>
             <w:pPr>
               <w:pStyle w:val="Compact"/>
-              <w:jc w:val="center"/>
+              <w:jc w:val="left"/>
             </w:pPr>
             <w:r>
               <w:t xml:space="preserve">×</w:t>
@@ -6572,7 +6463,7 @@
           <w:p>
             <w:pPr>
               <w:pStyle w:val="Compact"/>
-              <w:jc w:val="center"/>
+              <w:jc w:val="left"/>
             </w:pPr>
             <w:r>
               <w:t xml:space="preserve">√</w:t>
@@ -6584,7 +6475,7 @@
           <w:p>
             <w:pPr>
               <w:pStyle w:val="Compact"/>
-              <w:jc w:val="center"/>
+              <w:jc w:val="left"/>
             </w:pPr>
             <w:r>
               <w:t xml:space="preserve">×</w:t>
@@ -6596,7 +6487,7 @@
           <w:p>
             <w:pPr>
               <w:pStyle w:val="Compact"/>
-              <w:jc w:val="center"/>
+              <w:jc w:val="left"/>
             </w:pPr>
             <w:r>
               <w:t xml:space="preserve">×</w:t>
@@ -6608,7 +6499,7 @@
           <w:p>
             <w:pPr>
               <w:pStyle w:val="Compact"/>
-              <w:jc w:val="center"/>
+              <w:jc w:val="left"/>
             </w:pPr>
             <w:r>
               <w:t xml:space="preserve">×</w:t>
@@ -6620,7 +6511,7 @@
           <w:p>
             <w:pPr>
               <w:pStyle w:val="Compact"/>
-              <w:jc w:val="center"/>
+              <w:jc w:val="left"/>
             </w:pPr>
             <w:r>
               <w:t xml:space="preserve">√</w:t>
@@ -6673,7 +6564,7 @@
           <w:p>
             <w:pPr>
               <w:pStyle w:val="Compact"/>
-              <w:jc w:val="center"/>
+              <w:jc w:val="left"/>
             </w:pPr>
             <w:r>
               <w:t xml:space="preserve">√</w:t>
@@ -6685,7 +6576,7 @@
           <w:p>
             <w:pPr>
               <w:pStyle w:val="Compact"/>
-              <w:jc w:val="center"/>
+              <w:jc w:val="left"/>
             </w:pPr>
             <w:r>
               <w:t xml:space="preserve">×</w:t>
@@ -6697,7 +6588,7 @@
           <w:p>
             <w:pPr>
               <w:pStyle w:val="Compact"/>
-              <w:jc w:val="center"/>
+              <w:jc w:val="left"/>
             </w:pPr>
             <w:r>
               <w:t xml:space="preserve">×</w:t>
@@ -6709,7 +6600,7 @@
           <w:p>
             <w:pPr>
               <w:pStyle w:val="Compact"/>
-              <w:jc w:val="center"/>
+              <w:jc w:val="left"/>
             </w:pPr>
             <w:r>
               <w:t xml:space="preserve">√</w:t>
@@ -6721,7 +6612,7 @@
           <w:p>
             <w:pPr>
               <w:pStyle w:val="Compact"/>
-              <w:jc w:val="center"/>
+              <w:jc w:val="left"/>
             </w:pPr>
             <w:r>
               <w:t xml:space="preserve">√</w:t>
@@ -6774,7 +6665,7 @@
           <w:p>
             <w:pPr>
               <w:pStyle w:val="Compact"/>
-              <w:jc w:val="center"/>
+              <w:jc w:val="left"/>
             </w:pPr>
             <w:r>
               <w:t xml:space="preserve">√</w:t>
@@ -6786,7 +6677,7 @@
           <w:p>
             <w:pPr>
               <w:pStyle w:val="Compact"/>
-              <w:jc w:val="center"/>
+              <w:jc w:val="left"/>
             </w:pPr>
             <w:r>
               <w:t xml:space="preserve">×</w:t>
@@ -6798,7 +6689,7 @@
           <w:p>
             <w:pPr>
               <w:pStyle w:val="Compact"/>
-              <w:jc w:val="center"/>
+              <w:jc w:val="left"/>
             </w:pPr>
             <w:r>
               <w:t xml:space="preserve">×</w:t>
@@ -6810,7 +6701,7 @@
           <w:p>
             <w:pPr>
               <w:pStyle w:val="Compact"/>
-              <w:jc w:val="center"/>
+              <w:jc w:val="left"/>
             </w:pPr>
             <w:r>
               <w:t xml:space="preserve">×</w:t>
@@ -6822,7 +6713,7 @@
           <w:p>
             <w:pPr>
               <w:pStyle w:val="Compact"/>
-              <w:jc w:val="center"/>
+              <w:jc w:val="left"/>
             </w:pPr>
             <w:r>
               <w:t xml:space="preserve">√</w:t>
@@ -6875,7 +6766,7 @@
           <w:p>
             <w:pPr>
               <w:pStyle w:val="Compact"/>
-              <w:jc w:val="center"/>
+              <w:jc w:val="left"/>
             </w:pPr>
             <w:r>
               <w:t xml:space="preserve">×</w:t>
@@ -6887,7 +6778,7 @@
           <w:p>
             <w:pPr>
               <w:pStyle w:val="Compact"/>
-              <w:jc w:val="center"/>
+              <w:jc w:val="left"/>
             </w:pPr>
             <w:r>
               <w:t xml:space="preserve">√</w:t>
@@ -6899,7 +6790,7 @@
           <w:p>
             <w:pPr>
               <w:pStyle w:val="Compact"/>
-              <w:jc w:val="center"/>
+              <w:jc w:val="left"/>
             </w:pPr>
             <w:r>
               <w:t xml:space="preserve">×</w:t>
@@ -6911,7 +6802,7 @@
           <w:p>
             <w:pPr>
               <w:pStyle w:val="Compact"/>
-              <w:jc w:val="center"/>
+              <w:jc w:val="left"/>
             </w:pPr>
             <w:r>
               <w:t xml:space="preserve">×</w:t>
@@ -6923,7 +6814,7 @@
           <w:p>
             <w:pPr>
               <w:pStyle w:val="Compact"/>
-              <w:jc w:val="center"/>
+              <w:jc w:val="left"/>
             </w:pPr>
             <w:r>
               <w:t xml:space="preserve">×</w:t>
@@ -6939,19 +6830,7 @@
         <w:pStyle w:val="Heading3"/>
       </w:pPr>
       <w:r>
-        <w:t xml:space="preserve"> </w:t>
-      </w:r>
-      <w:r>
-        <w:t xml:space="preserve">2.4.2</w:t>
-      </w:r>
-      <w:r>
-        <w:t xml:space="preserve"> </w:t>
-      </w:r>
-      <w:r>
-        <w:t xml:space="preserve"> </w:t>
-      </w:r>
-      <w:r>
-        <w:t xml:space="preserve">Blockchain-Based Healthcare Data Governance</w:t>
+        <w:t xml:space="preserve">2.4.2 Blockchain-Based Healthcare Data Governance</w:t>
       </w:r>
     </w:p>
     <w:p>
@@ -7027,14 +6906,14 @@
         <w:tblCaption w:val="Table 2.5: Descriptions, issues and limitations of the studies on blockchain-based healthcare data governance and their coverage of the key requirements"/>
       </w:tblPr>
       <w:tblGrid>
-        <w:gridCol w:w="728"/>
-        <w:gridCol w:w="2457"/>
-        <w:gridCol w:w="2457"/>
-        <w:gridCol w:w="455"/>
-        <w:gridCol w:w="455"/>
-        <w:gridCol w:w="455"/>
-        <w:gridCol w:w="455"/>
-        <w:gridCol w:w="455"/>
+        <w:gridCol w:w="546"/>
+        <w:gridCol w:w="2321"/>
+        <w:gridCol w:w="2321"/>
+        <w:gridCol w:w="546"/>
+        <w:gridCol w:w="546"/>
+        <w:gridCol w:w="546"/>
+        <w:gridCol w:w="546"/>
+        <w:gridCol w:w="546"/>
       </w:tblGrid>
       <w:tr>
         <w:trPr>
@@ -7118,7 +6997,7 @@
           <w:p>
             <w:pPr>
               <w:pStyle w:val="Compact"/>
-              <w:jc w:val="center"/>
+              <w:jc w:val="left"/>
             </w:pPr>
             <w:r>
               <w:rPr>
@@ -7140,7 +7019,7 @@
           <w:p>
             <w:pPr>
               <w:pStyle w:val="Compact"/>
-              <w:jc w:val="center"/>
+              <w:jc w:val="left"/>
             </w:pPr>
             <w:r>
               <w:rPr>
@@ -7162,7 +7041,7 @@
           <w:p>
             <w:pPr>
               <w:pStyle w:val="Compact"/>
-              <w:jc w:val="center"/>
+              <w:jc w:val="left"/>
             </w:pPr>
             <w:r>
               <w:rPr>
@@ -7184,7 +7063,7 @@
           <w:p>
             <w:pPr>
               <w:pStyle w:val="Compact"/>
-              <w:jc w:val="center"/>
+              <w:jc w:val="left"/>
             </w:pPr>
             <w:r>
               <w:rPr>
@@ -7206,7 +7085,7 @@
           <w:p>
             <w:pPr>
               <w:pStyle w:val="Compact"/>
-              <w:jc w:val="center"/>
+              <w:jc w:val="left"/>
             </w:pPr>
             <w:r>
               <w:rPr>
@@ -7263,7 +7142,7 @@
           <w:p>
             <w:pPr>
               <w:pStyle w:val="Compact"/>
-              <w:jc w:val="center"/>
+              <w:jc w:val="left"/>
             </w:pPr>
             <w:r>
               <w:t xml:space="preserve">×</w:t>
@@ -7275,7 +7154,7 @@
           <w:p>
             <w:pPr>
               <w:pStyle w:val="Compact"/>
-              <w:jc w:val="center"/>
+              <w:jc w:val="left"/>
             </w:pPr>
             <w:r>
               <w:t xml:space="preserve">×</w:t>
@@ -7287,7 +7166,7 @@
           <w:p>
             <w:pPr>
               <w:pStyle w:val="Compact"/>
-              <w:jc w:val="center"/>
+              <w:jc w:val="left"/>
             </w:pPr>
             <w:r>
               <w:t xml:space="preserve">×</w:t>
@@ -7299,7 +7178,7 @@
           <w:p>
             <w:pPr>
               <w:pStyle w:val="Compact"/>
-              <w:jc w:val="center"/>
+              <w:jc w:val="left"/>
             </w:pPr>
             <w:r>
               <w:t xml:space="preserve">√</w:t>
@@ -7311,7 +7190,7 @@
           <w:p>
             <w:pPr>
               <w:pStyle w:val="Compact"/>
-              <w:jc w:val="center"/>
+              <w:jc w:val="left"/>
             </w:pPr>
             <w:r>
               <w:t xml:space="preserve">√</w:t>
@@ -7364,7 +7243,7 @@
           <w:p>
             <w:pPr>
               <w:pStyle w:val="Compact"/>
-              <w:jc w:val="center"/>
+              <w:jc w:val="left"/>
             </w:pPr>
             <w:r>
               <w:t xml:space="preserve">×</w:t>
@@ -7376,7 +7255,7 @@
           <w:p>
             <w:pPr>
               <w:pStyle w:val="Compact"/>
-              <w:jc w:val="center"/>
+              <w:jc w:val="left"/>
             </w:pPr>
             <w:r>
               <w:t xml:space="preserve">×</w:t>
@@ -7388,7 +7267,7 @@
           <w:p>
             <w:pPr>
               <w:pStyle w:val="Compact"/>
-              <w:jc w:val="center"/>
+              <w:jc w:val="left"/>
             </w:pPr>
             <w:r>
               <w:t xml:space="preserve">×</w:t>
@@ -7400,7 +7279,7 @@
           <w:p>
             <w:pPr>
               <w:pStyle w:val="Compact"/>
-              <w:jc w:val="center"/>
+              <w:jc w:val="left"/>
             </w:pPr>
             <w:r>
               <w:t xml:space="preserve">√</w:t>
@@ -7412,7 +7291,7 @@
           <w:p>
             <w:pPr>
               <w:pStyle w:val="Compact"/>
-              <w:jc w:val="center"/>
+              <w:jc w:val="left"/>
             </w:pPr>
             <w:r>
               <w:t xml:space="preserve">√</w:t>
@@ -7465,7 +7344,7 @@
           <w:p>
             <w:pPr>
               <w:pStyle w:val="Compact"/>
-              <w:jc w:val="center"/>
+              <w:jc w:val="left"/>
             </w:pPr>
             <w:r>
               <w:t xml:space="preserve">×</w:t>
@@ -7477,7 +7356,7 @@
           <w:p>
             <w:pPr>
               <w:pStyle w:val="Compact"/>
-              <w:jc w:val="center"/>
+              <w:jc w:val="left"/>
             </w:pPr>
             <w:r>
               <w:t xml:space="preserve">×</w:t>
@@ -7489,7 +7368,7 @@
           <w:p>
             <w:pPr>
               <w:pStyle w:val="Compact"/>
-              <w:jc w:val="center"/>
+              <w:jc w:val="left"/>
             </w:pPr>
             <w:r>
               <w:t xml:space="preserve">×</w:t>
@@ -7501,7 +7380,7 @@
           <w:p>
             <w:pPr>
               <w:pStyle w:val="Compact"/>
-              <w:jc w:val="center"/>
+              <w:jc w:val="left"/>
             </w:pPr>
             <w:r>
               <w:t xml:space="preserve">√</w:t>
@@ -7513,7 +7392,7 @@
           <w:p>
             <w:pPr>
               <w:pStyle w:val="Compact"/>
-              <w:jc w:val="center"/>
+              <w:jc w:val="left"/>
             </w:pPr>
             <w:r>
               <w:t xml:space="preserve">√</w:t>
@@ -7566,7 +7445,7 @@
           <w:p>
             <w:pPr>
               <w:pStyle w:val="Compact"/>
-              <w:jc w:val="center"/>
+              <w:jc w:val="left"/>
             </w:pPr>
             <w:r>
               <w:t xml:space="preserve">×</w:t>
@@ -7578,7 +7457,7 @@
           <w:p>
             <w:pPr>
               <w:pStyle w:val="Compact"/>
-              <w:jc w:val="center"/>
+              <w:jc w:val="left"/>
             </w:pPr>
             <w:r>
               <w:t xml:space="preserve">×</w:t>
@@ -7590,7 +7469,7 @@
           <w:p>
             <w:pPr>
               <w:pStyle w:val="Compact"/>
-              <w:jc w:val="center"/>
+              <w:jc w:val="left"/>
             </w:pPr>
             <w:r>
               <w:t xml:space="preserve">×</w:t>
@@ -7602,7 +7481,7 @@
           <w:p>
             <w:pPr>
               <w:pStyle w:val="Compact"/>
-              <w:jc w:val="center"/>
+              <w:jc w:val="left"/>
             </w:pPr>
             <w:r>
               <w:t xml:space="preserve">√</w:t>
@@ -7614,7 +7493,7 @@
           <w:p>
             <w:pPr>
               <w:pStyle w:val="Compact"/>
-              <w:jc w:val="center"/>
+              <w:jc w:val="left"/>
             </w:pPr>
             <w:r>
               <w:t xml:space="preserve">√</w:t>
@@ -7667,7 +7546,7 @@
           <w:p>
             <w:pPr>
               <w:pStyle w:val="Compact"/>
-              <w:jc w:val="center"/>
+              <w:jc w:val="left"/>
             </w:pPr>
             <w:r>
               <w:t xml:space="preserve">√</w:t>
@@ -7679,7 +7558,7 @@
           <w:p>
             <w:pPr>
               <w:pStyle w:val="Compact"/>
-              <w:jc w:val="center"/>
+              <w:jc w:val="left"/>
             </w:pPr>
             <w:r>
               <w:t xml:space="preserve">×</w:t>
@@ -7691,7 +7570,7 @@
           <w:p>
             <w:pPr>
               <w:pStyle w:val="Compact"/>
-              <w:jc w:val="center"/>
+              <w:jc w:val="left"/>
             </w:pPr>
             <w:r>
               <w:t xml:space="preserve">×</w:t>
@@ -7703,7 +7582,7 @@
           <w:p>
             <w:pPr>
               <w:pStyle w:val="Compact"/>
-              <w:jc w:val="center"/>
+              <w:jc w:val="left"/>
             </w:pPr>
             <w:r>
               <w:t xml:space="preserve">×</w:t>
@@ -7715,7 +7594,7 @@
           <w:p>
             <w:pPr>
               <w:pStyle w:val="Compact"/>
-              <w:jc w:val="center"/>
+              <w:jc w:val="left"/>
             </w:pPr>
             <w:r>
               <w:t xml:space="preserve">√</w:t>
@@ -7731,9 +7610,6 @@
         <w:pStyle w:val="Heading3"/>
       </w:pPr>
       <w:r>
-        <w:t xml:space="preserve"> </w:t>
-      </w:r>
-      <w:r>
         <w:t xml:space="preserve">2.4.3 Decentralised Identity and Verifiable Credentials</w:t>
       </w:r>
     </w:p>
@@ -7742,7 +7618,7 @@
         <w:pStyle w:val="FirstParagraph"/>
       </w:pPr>
       <w:r>
-        <w:t xml:space="preserve">Decentralised Identity (DID) and Verifiable Credentials (VCs) provide an alternative to conventional identity architectures based exclusively on centralised identity providers. DID-based systems enable entities to establish persistent and cryptographically verifiable identifiers, while VCs provide verifiable claims concerning roles, attributes, qualifications, or other properties associated with an entity [6, 18, 20, 36].</w:t>
+        <w:t xml:space="preserve">Decentralised Identifiers (DIDs) and Verifiable Credentials (VCs) provide an alternative to conventional identity architectures based exclusively on centralised identity providers. DID-based systems enable entities to establish persistent and cryptographically verifiable identifiers, while VCs provide verifiable claims concerning roles, attributes, qualifications, or other properties associated with an entity [6, 18, 20, 36].</w:t>
       </w:r>
     </w:p>
     <w:p>
@@ -7758,7 +7634,7 @@
         <w:pStyle w:val="BodyText"/>
       </w:pPr>
       <w:r>
-        <w:t xml:space="preserve">These mechanisms are particularly relevant to healthcare and other sensitive data-sharing environments because they can reduce dependence on a single identity provider and provide stronger control over the disclosure of participant attributes.Reviews of blockchain-based identity management for the Internet of Things reach the same conclusion for constrained devices [17, 18]. However, the literature also reveals an important conceptual distinction between identity and authority.</w:t>
+        <w:t xml:space="preserve">These mechanisms are particularly relevant to healthcare and other sensitive data-sharing environments because they can reduce dependence on a single identity provider and provide stronger control over the disclosure of participant attributes. Reviews of blockchain-based identity management for the Internet of Things (IoT) reach the same conclusion for constrained devices [17, 18]. However, the literature also reveals an important conceptual distinction between identity and authority.</w:t>
       </w:r>
     </w:p>
     <w:p>
@@ -7926,14 +7802,14 @@
         <w:tblCaption w:val="Table 2.6: Descriptions, issues and limitations of the studies on decentralised identity and verifiable credentials and their coverage of the key requirements"/>
       </w:tblPr>
       <w:tblGrid>
-        <w:gridCol w:w="728"/>
-        <w:gridCol w:w="2457"/>
-        <w:gridCol w:w="2457"/>
-        <w:gridCol w:w="455"/>
-        <w:gridCol w:w="455"/>
-        <w:gridCol w:w="455"/>
-        <w:gridCol w:w="455"/>
-        <w:gridCol w:w="455"/>
+        <w:gridCol w:w="546"/>
+        <w:gridCol w:w="2321"/>
+        <w:gridCol w:w="2321"/>
+        <w:gridCol w:w="546"/>
+        <w:gridCol w:w="546"/>
+        <w:gridCol w:w="546"/>
+        <w:gridCol w:w="546"/>
+        <w:gridCol w:w="546"/>
       </w:tblGrid>
       <w:tr>
         <w:trPr>
@@ -8017,7 +7893,7 @@
           <w:p>
             <w:pPr>
               <w:pStyle w:val="Compact"/>
-              <w:jc w:val="center"/>
+              <w:jc w:val="left"/>
             </w:pPr>
             <w:r>
               <w:rPr>
@@ -8039,7 +7915,7 @@
           <w:p>
             <w:pPr>
               <w:pStyle w:val="Compact"/>
-              <w:jc w:val="center"/>
+              <w:jc w:val="left"/>
             </w:pPr>
             <w:r>
               <w:rPr>
@@ -8061,7 +7937,7 @@
           <w:p>
             <w:pPr>
               <w:pStyle w:val="Compact"/>
-              <w:jc w:val="center"/>
+              <w:jc w:val="left"/>
             </w:pPr>
             <w:r>
               <w:rPr>
@@ -8083,7 +7959,7 @@
           <w:p>
             <w:pPr>
               <w:pStyle w:val="Compact"/>
-              <w:jc w:val="center"/>
+              <w:jc w:val="left"/>
             </w:pPr>
             <w:r>
               <w:rPr>
@@ -8105,7 +7981,7 @@
           <w:p>
             <w:pPr>
               <w:pStyle w:val="Compact"/>
-              <w:jc w:val="center"/>
+              <w:jc w:val="left"/>
             </w:pPr>
             <w:r>
               <w:rPr>
@@ -8162,7 +8038,7 @@
           <w:p>
             <w:pPr>
               <w:pStyle w:val="Compact"/>
-              <w:jc w:val="center"/>
+              <w:jc w:val="left"/>
             </w:pPr>
             <w:r>
               <w:t xml:space="preserve">×</w:t>
@@ -8174,7 +8050,7 @@
           <w:p>
             <w:pPr>
               <w:pStyle w:val="Compact"/>
-              <w:jc w:val="center"/>
+              <w:jc w:val="left"/>
             </w:pPr>
             <w:r>
               <w:t xml:space="preserve">√</w:t>
@@ -8186,7 +8062,7 @@
           <w:p>
             <w:pPr>
               <w:pStyle w:val="Compact"/>
-              <w:jc w:val="center"/>
+              <w:jc w:val="left"/>
             </w:pPr>
             <w:r>
               <w:t xml:space="preserve">√</w:t>
@@ -8198,7 +8074,7 @@
           <w:p>
             <w:pPr>
               <w:pStyle w:val="Compact"/>
-              <w:jc w:val="center"/>
+              <w:jc w:val="left"/>
             </w:pPr>
             <w:r>
               <w:t xml:space="preserve">×</w:t>
@@ -8210,7 +8086,7 @@
           <w:p>
             <w:pPr>
               <w:pStyle w:val="Compact"/>
-              <w:jc w:val="center"/>
+              <w:jc w:val="left"/>
             </w:pPr>
             <w:r>
               <w:t xml:space="preserve">×</w:t>
@@ -8263,7 +8139,7 @@
           <w:p>
             <w:pPr>
               <w:pStyle w:val="Compact"/>
-              <w:jc w:val="center"/>
+              <w:jc w:val="left"/>
             </w:pPr>
             <w:r>
               <w:t xml:space="preserve">×</w:t>
@@ -8275,7 +8151,7 @@
           <w:p>
             <w:pPr>
               <w:pStyle w:val="Compact"/>
-              <w:jc w:val="center"/>
+              <w:jc w:val="left"/>
             </w:pPr>
             <w:r>
               <w:t xml:space="preserve">√</w:t>
@@ -8287,7 +8163,7 @@
           <w:p>
             <w:pPr>
               <w:pStyle w:val="Compact"/>
-              <w:jc w:val="center"/>
+              <w:jc w:val="left"/>
             </w:pPr>
             <w:r>
               <w:t xml:space="preserve">×</w:t>
@@ -8299,7 +8175,7 @@
           <w:p>
             <w:pPr>
               <w:pStyle w:val="Compact"/>
-              <w:jc w:val="center"/>
+              <w:jc w:val="left"/>
             </w:pPr>
             <w:r>
               <w:t xml:space="preserve">×</w:t>
@@ -8311,7 +8187,7 @@
           <w:p>
             <w:pPr>
               <w:pStyle w:val="Compact"/>
-              <w:jc w:val="center"/>
+              <w:jc w:val="left"/>
             </w:pPr>
             <w:r>
               <w:t xml:space="preserve">×</w:t>
@@ -8364,7 +8240,7 @@
           <w:p>
             <w:pPr>
               <w:pStyle w:val="Compact"/>
-              <w:jc w:val="center"/>
+              <w:jc w:val="left"/>
             </w:pPr>
             <w:r>
               <w:t xml:space="preserve">×</w:t>
@@ -8376,7 +8252,7 @@
           <w:p>
             <w:pPr>
               <w:pStyle w:val="Compact"/>
-              <w:jc w:val="center"/>
+              <w:jc w:val="left"/>
             </w:pPr>
             <w:r>
               <w:t xml:space="preserve">√</w:t>
@@ -8388,7 +8264,7 @@
           <w:p>
             <w:pPr>
               <w:pStyle w:val="Compact"/>
-              <w:jc w:val="center"/>
+              <w:jc w:val="left"/>
             </w:pPr>
             <w:r>
               <w:t xml:space="preserve">×</w:t>
@@ -8400,7 +8276,7 @@
           <w:p>
             <w:pPr>
               <w:pStyle w:val="Compact"/>
-              <w:jc w:val="center"/>
+              <w:jc w:val="left"/>
             </w:pPr>
             <w:r>
               <w:t xml:space="preserve">√</w:t>
@@ -8412,7 +8288,7 @@
           <w:p>
             <w:pPr>
               <w:pStyle w:val="Compact"/>
-              <w:jc w:val="center"/>
+              <w:jc w:val="left"/>
             </w:pPr>
             <w:r>
               <w:t xml:space="preserve">×</w:t>
@@ -8465,7 +8341,7 @@
           <w:p>
             <w:pPr>
               <w:pStyle w:val="Compact"/>
-              <w:jc w:val="center"/>
+              <w:jc w:val="left"/>
             </w:pPr>
             <w:r>
               <w:t xml:space="preserve">×</w:t>
@@ -8477,7 +8353,7 @@
           <w:p>
             <w:pPr>
               <w:pStyle w:val="Compact"/>
-              <w:jc w:val="center"/>
+              <w:jc w:val="left"/>
             </w:pPr>
             <w:r>
               <w:t xml:space="preserve">√</w:t>
@@ -8489,7 +8365,7 @@
           <w:p>
             <w:pPr>
               <w:pStyle w:val="Compact"/>
-              <w:jc w:val="center"/>
+              <w:jc w:val="left"/>
             </w:pPr>
             <w:r>
               <w:t xml:space="preserve">×</w:t>
@@ -8501,7 +8377,7 @@
           <w:p>
             <w:pPr>
               <w:pStyle w:val="Compact"/>
-              <w:jc w:val="center"/>
+              <w:jc w:val="left"/>
             </w:pPr>
             <w:r>
               <w:t xml:space="preserve">√</w:t>
@@ -8513,7 +8389,7 @@
           <w:p>
             <w:pPr>
               <w:pStyle w:val="Compact"/>
-              <w:jc w:val="center"/>
+              <w:jc w:val="left"/>
             </w:pPr>
             <w:r>
               <w:t xml:space="preserve">×</w:t>
@@ -8566,7 +8442,7 @@
           <w:p>
             <w:pPr>
               <w:pStyle w:val="Compact"/>
-              <w:jc w:val="center"/>
+              <w:jc w:val="left"/>
             </w:pPr>
             <w:r>
               <w:t xml:space="preserve">×</w:t>
@@ -8578,7 +8454,7 @@
           <w:p>
             <w:pPr>
               <w:pStyle w:val="Compact"/>
-              <w:jc w:val="center"/>
+              <w:jc w:val="left"/>
             </w:pPr>
             <w:r>
               <w:t xml:space="preserve">√</w:t>
@@ -8590,7 +8466,7 @@
           <w:p>
             <w:pPr>
               <w:pStyle w:val="Compact"/>
-              <w:jc w:val="center"/>
+              <w:jc w:val="left"/>
             </w:pPr>
             <w:r>
               <w:t xml:space="preserve">×</w:t>
@@ -8602,7 +8478,7 @@
           <w:p>
             <w:pPr>
               <w:pStyle w:val="Compact"/>
-              <w:jc w:val="center"/>
+              <w:jc w:val="left"/>
             </w:pPr>
             <w:r>
               <w:t xml:space="preserve">×</w:t>
@@ -8614,7 +8490,7 @@
           <w:p>
             <w:pPr>
               <w:pStyle w:val="Compact"/>
-              <w:jc w:val="center"/>
+              <w:jc w:val="left"/>
             </w:pPr>
             <w:r>
               <w:t xml:space="preserve">×</w:t>
@@ -8667,7 +8543,7 @@
           <w:p>
             <w:pPr>
               <w:pStyle w:val="Compact"/>
-              <w:jc w:val="center"/>
+              <w:jc w:val="left"/>
             </w:pPr>
             <w:r>
               <w:t xml:space="preserve">×</w:t>
@@ -8679,7 +8555,7 @@
           <w:p>
             <w:pPr>
               <w:pStyle w:val="Compact"/>
-              <w:jc w:val="center"/>
+              <w:jc w:val="left"/>
             </w:pPr>
             <w:r>
               <w:t xml:space="preserve">√</w:t>
@@ -8691,7 +8567,7 @@
           <w:p>
             <w:pPr>
               <w:pStyle w:val="Compact"/>
-              <w:jc w:val="center"/>
+              <w:jc w:val="left"/>
             </w:pPr>
             <w:r>
               <w:t xml:space="preserve">×</w:t>
@@ -8703,7 +8579,7 @@
           <w:p>
             <w:pPr>
               <w:pStyle w:val="Compact"/>
-              <w:jc w:val="center"/>
+              <w:jc w:val="left"/>
             </w:pPr>
             <w:r>
               <w:t xml:space="preserve">×</w:t>
@@ -8715,7 +8591,7 @@
           <w:p>
             <w:pPr>
               <w:pStyle w:val="Compact"/>
-              <w:jc w:val="center"/>
+              <w:jc w:val="left"/>
             </w:pPr>
             <w:r>
               <w:t xml:space="preserve">×</w:t>
@@ -8768,7 +8644,7 @@
           <w:p>
             <w:pPr>
               <w:pStyle w:val="Compact"/>
-              <w:jc w:val="center"/>
+              <w:jc w:val="left"/>
             </w:pPr>
             <w:r>
               <w:t xml:space="preserve">×</w:t>
@@ -8780,7 +8656,7 @@
           <w:p>
             <w:pPr>
               <w:pStyle w:val="Compact"/>
-              <w:jc w:val="center"/>
+              <w:jc w:val="left"/>
             </w:pPr>
             <w:r>
               <w:t xml:space="preserve">√</w:t>
@@ -8792,7 +8668,7 @@
           <w:p>
             <w:pPr>
               <w:pStyle w:val="Compact"/>
-              <w:jc w:val="center"/>
+              <w:jc w:val="left"/>
             </w:pPr>
             <w:r>
               <w:t xml:space="preserve">×</w:t>
@@ -8804,7 +8680,7 @@
           <w:p>
             <w:pPr>
               <w:pStyle w:val="Compact"/>
-              <w:jc w:val="center"/>
+              <w:jc w:val="left"/>
             </w:pPr>
             <w:r>
               <w:t xml:space="preserve">×</w:t>
@@ -8816,7 +8692,7 @@
           <w:p>
             <w:pPr>
               <w:pStyle w:val="Compact"/>
-              <w:jc w:val="center"/>
+              <w:jc w:val="left"/>
             </w:pPr>
             <w:r>
               <w:t xml:space="preserve">√</w:t>
@@ -8832,19 +8708,7 @@
         <w:pStyle w:val="Heading3"/>
       </w:pPr>
       <w:r>
-        <w:t xml:space="preserve"> </w:t>
-      </w:r>
-      <w:r>
-        <w:t xml:space="preserve">2.4.4</w:t>
-      </w:r>
-      <w:r>
-        <w:t xml:space="preserve"> </w:t>
-      </w:r>
-      <w:r>
-        <w:t xml:space="preserve"> </w:t>
-      </w:r>
-      <w:r>
-        <w:t xml:space="preserve">Multi-Party and Decentralised Governance</w:t>
+        <w:t xml:space="preserve">2.4.4 Multi-Party and Decentralised Governance</w:t>
       </w:r>
     </w:p>
     <w:p>
@@ -8860,7 +8724,7 @@
         <w:pStyle w:val="BodyText"/>
       </w:pPr>
       <w:r>
-        <w:t xml:space="preserve">More generally, multi-party data-sharing environments require mechanisms capable of supporting collaborative governance. Research on decentralised data trusts has explored platforms through which multiple parties can participate in data-sharing arrangements and governance processes [19].A decentralised trust framework for multi-stakeholder livestock data sharing shows that controlled exposure to authorised entities can be achieved without a central authority [1]. A blockchain-aided data-governance framework for multi-stakeholder applications lets the data owner manage consent and disclose data selectively while the data consumers verify its provenance, and demonstrates this on an e-prescription case involving patients, doctors and pharmacists [8]. FutureDID further demonstrates that multi-party verification can be incorporated into decentralised identity processes [6].</w:t>
+        <w:t xml:space="preserve">More generally, multi-party data-sharing environments require mechanisms capable of supporting collaborative governance. Research on decentralised data trusts has explored platforms through which multiple parties can participate in data-sharing arrangements and governance processes [19]. A decentralised trust framework for multi-stakeholder livestock data sharing shows that controlled exposure to authorised entities can be achieved without a central authority [1]. A blockchain-aided data-governance framework for multi-stakeholder applications lets the data owner manage consent and disclose data selectively while the data consumers verify its provenance, and demonstrates this on an e-prescription case involving patients, doctors and pharmacists [8]. FutureDID further demonstrates that multi-party verification can be incorporated into decentralised identity processes [6].</w:t>
       </w:r>
     </w:p>
     <w:p>
@@ -8912,14 +8776,14 @@
         <w:tblCaption w:val="Table 2.7: Descriptions, issues and limitations of the studies on multi-party and decentralised governance and their coverage of the key requirements"/>
       </w:tblPr>
       <w:tblGrid>
-        <w:gridCol w:w="728"/>
-        <w:gridCol w:w="2457"/>
-        <w:gridCol w:w="2457"/>
-        <w:gridCol w:w="455"/>
-        <w:gridCol w:w="455"/>
-        <w:gridCol w:w="455"/>
-        <w:gridCol w:w="455"/>
-        <w:gridCol w:w="455"/>
+        <w:gridCol w:w="546"/>
+        <w:gridCol w:w="2321"/>
+        <w:gridCol w:w="2321"/>
+        <w:gridCol w:w="546"/>
+        <w:gridCol w:w="546"/>
+        <w:gridCol w:w="546"/>
+        <w:gridCol w:w="546"/>
+        <w:gridCol w:w="546"/>
       </w:tblGrid>
       <w:tr>
         <w:trPr>
@@ -9003,7 +8867,7 @@
           <w:p>
             <w:pPr>
               <w:pStyle w:val="Compact"/>
-              <w:jc w:val="center"/>
+              <w:jc w:val="left"/>
             </w:pPr>
             <w:r>
               <w:rPr>
@@ -9025,7 +8889,7 @@
           <w:p>
             <w:pPr>
               <w:pStyle w:val="Compact"/>
-              <w:jc w:val="center"/>
+              <w:jc w:val="left"/>
             </w:pPr>
             <w:r>
               <w:rPr>
@@ -9047,7 +8911,7 @@
           <w:p>
             <w:pPr>
               <w:pStyle w:val="Compact"/>
-              <w:jc w:val="center"/>
+              <w:jc w:val="left"/>
             </w:pPr>
             <w:r>
               <w:rPr>
@@ -9069,7 +8933,7 @@
           <w:p>
             <w:pPr>
               <w:pStyle w:val="Compact"/>
-              <w:jc w:val="center"/>
+              <w:jc w:val="left"/>
             </w:pPr>
             <w:r>
               <w:rPr>
@@ -9091,7 +8955,7 @@
           <w:p>
             <w:pPr>
               <w:pStyle w:val="Compact"/>
-              <w:jc w:val="center"/>
+              <w:jc w:val="left"/>
             </w:pPr>
             <w:r>
               <w:rPr>
@@ -9148,7 +9012,7 @@
           <w:p>
             <w:pPr>
               <w:pStyle w:val="Compact"/>
-              <w:jc w:val="center"/>
+              <w:jc w:val="left"/>
             </w:pPr>
             <w:r>
               <w:t xml:space="preserve">×</w:t>
@@ -9160,7 +9024,7 @@
           <w:p>
             <w:pPr>
               <w:pStyle w:val="Compact"/>
-              <w:jc w:val="center"/>
+              <w:jc w:val="left"/>
             </w:pPr>
             <w:r>
               <w:t xml:space="preserve">√</w:t>
@@ -9172,7 +9036,7 @@
           <w:p>
             <w:pPr>
               <w:pStyle w:val="Compact"/>
-              <w:jc w:val="center"/>
+              <w:jc w:val="left"/>
             </w:pPr>
             <w:r>
               <w:t xml:space="preserve">×</w:t>
@@ -9184,7 +9048,7 @@
           <w:p>
             <w:pPr>
               <w:pStyle w:val="Compact"/>
-              <w:jc w:val="center"/>
+              <w:jc w:val="left"/>
             </w:pPr>
             <w:r>
               <w:t xml:space="preserve">√</w:t>
@@ -9196,7 +9060,7 @@
           <w:p>
             <w:pPr>
               <w:pStyle w:val="Compact"/>
-              <w:jc w:val="center"/>
+              <w:jc w:val="left"/>
             </w:pPr>
             <w:r>
               <w:t xml:space="preserve">√</w:t>
@@ -9249,7 +9113,7 @@
           <w:p>
             <w:pPr>
               <w:pStyle w:val="Compact"/>
-              <w:jc w:val="center"/>
+              <w:jc w:val="left"/>
             </w:pPr>
             <w:r>
               <w:t xml:space="preserve">×</w:t>
@@ -9261,7 +9125,7 @@
           <w:p>
             <w:pPr>
               <w:pStyle w:val="Compact"/>
-              <w:jc w:val="center"/>
+              <w:jc w:val="left"/>
             </w:pPr>
             <w:r>
               <w:t xml:space="preserve">×</w:t>
@@ -9273,7 +9137,7 @@
           <w:p>
             <w:pPr>
               <w:pStyle w:val="Compact"/>
-              <w:jc w:val="center"/>
+              <w:jc w:val="left"/>
             </w:pPr>
             <w:r>
               <w:t xml:space="preserve">√</w:t>
@@ -9285,7 +9149,7 @@
           <w:p>
             <w:pPr>
               <w:pStyle w:val="Compact"/>
-              <w:jc w:val="center"/>
+              <w:jc w:val="left"/>
             </w:pPr>
             <w:r>
               <w:t xml:space="preserve">√</w:t>
@@ -9297,7 +9161,7 @@
           <w:p>
             <w:pPr>
               <w:pStyle w:val="Compact"/>
-              <w:jc w:val="center"/>
+              <w:jc w:val="left"/>
             </w:pPr>
             <w:r>
               <w:t xml:space="preserve">×</w:t>
@@ -9350,7 +9214,7 @@
           <w:p>
             <w:pPr>
               <w:pStyle w:val="Compact"/>
-              <w:jc w:val="center"/>
+              <w:jc w:val="left"/>
             </w:pPr>
             <w:r>
               <w:t xml:space="preserve">√</w:t>
@@ -9362,7 +9226,7 @@
           <w:p>
             <w:pPr>
               <w:pStyle w:val="Compact"/>
-              <w:jc w:val="center"/>
+              <w:jc w:val="left"/>
             </w:pPr>
             <w:r>
               <w:t xml:space="preserve">×</w:t>
@@ -9374,7 +9238,7 @@
           <w:p>
             <w:pPr>
               <w:pStyle w:val="Compact"/>
-              <w:jc w:val="center"/>
+              <w:jc w:val="left"/>
             </w:pPr>
             <w:r>
               <w:t xml:space="preserve">×</w:t>
@@ -9386,7 +9250,7 @@
           <w:p>
             <w:pPr>
               <w:pStyle w:val="Compact"/>
-              <w:jc w:val="center"/>
+              <w:jc w:val="left"/>
             </w:pPr>
             <w:r>
               <w:t xml:space="preserve">√</w:t>
@@ -9398,7 +9262,7 @@
           <w:p>
             <w:pPr>
               <w:pStyle w:val="Compact"/>
-              <w:jc w:val="center"/>
+              <w:jc w:val="left"/>
             </w:pPr>
             <w:r>
               <w:t xml:space="preserve">√</w:t>
@@ -9451,7 +9315,7 @@
           <w:p>
             <w:pPr>
               <w:pStyle w:val="Compact"/>
-              <w:jc w:val="center"/>
+              <w:jc w:val="left"/>
             </w:pPr>
             <w:r>
               <w:t xml:space="preserve">×</w:t>
@@ -9463,7 +9327,7 @@
           <w:p>
             <w:pPr>
               <w:pStyle w:val="Compact"/>
-              <w:jc w:val="center"/>
+              <w:jc w:val="left"/>
             </w:pPr>
             <w:r>
               <w:t xml:space="preserve">√</w:t>
@@ -9475,7 +9339,7 @@
           <w:p>
             <w:pPr>
               <w:pStyle w:val="Compact"/>
-              <w:jc w:val="center"/>
+              <w:jc w:val="left"/>
             </w:pPr>
             <w:r>
               <w:t xml:space="preserve">√</w:t>
@@ -9487,7 +9351,7 @@
           <w:p>
             <w:pPr>
               <w:pStyle w:val="Compact"/>
-              <w:jc w:val="center"/>
+              <w:jc w:val="left"/>
             </w:pPr>
             <w:r>
               <w:t xml:space="preserve">×</w:t>
@@ -9499,7 +9363,7 @@
           <w:p>
             <w:pPr>
               <w:pStyle w:val="Compact"/>
-              <w:jc w:val="center"/>
+              <w:jc w:val="left"/>
             </w:pPr>
             <w:r>
               <w:t xml:space="preserve">×</w:t>
@@ -9515,19 +9379,7 @@
         <w:pStyle w:val="Heading3"/>
       </w:pPr>
       <w:r>
-        <w:t xml:space="preserve"> </w:t>
-      </w:r>
-      <w:r>
-        <w:t xml:space="preserve">2.4.5</w:t>
-      </w:r>
-      <w:r>
-        <w:t xml:space="preserve"> </w:t>
-      </w:r>
-      <w:r>
-        <w:t xml:space="preserve"> </w:t>
-      </w:r>
-      <w:r>
-        <w:t xml:space="preserve">Policy-Based and Healthcare Access Control</w:t>
+        <w:t xml:space="preserve">2.4.5 Policy-Based and Healthcare Access Control</w:t>
       </w:r>
     </w:p>
     <w:p>
@@ -10154,14 +10006,14 @@
         <w:tblCaption w:val="Table 2.8: Descriptions, issues and limitations of the studies on policy-based and healthcare access control and their coverage of the key requirements"/>
       </w:tblPr>
       <w:tblGrid>
-        <w:gridCol w:w="728"/>
-        <w:gridCol w:w="2457"/>
-        <w:gridCol w:w="2457"/>
-        <w:gridCol w:w="455"/>
-        <w:gridCol w:w="455"/>
-        <w:gridCol w:w="455"/>
-        <w:gridCol w:w="455"/>
-        <w:gridCol w:w="455"/>
+        <w:gridCol w:w="546"/>
+        <w:gridCol w:w="2321"/>
+        <w:gridCol w:w="2321"/>
+        <w:gridCol w:w="546"/>
+        <w:gridCol w:w="546"/>
+        <w:gridCol w:w="546"/>
+        <w:gridCol w:w="546"/>
+        <w:gridCol w:w="546"/>
       </w:tblGrid>
       <w:tr>
         <w:trPr>
@@ -10245,7 +10097,7 @@
           <w:p>
             <w:pPr>
               <w:pStyle w:val="Compact"/>
-              <w:jc w:val="center"/>
+              <w:jc w:val="left"/>
             </w:pPr>
             <w:r>
               <w:rPr>
@@ -10267,7 +10119,7 @@
           <w:p>
             <w:pPr>
               <w:pStyle w:val="Compact"/>
-              <w:jc w:val="center"/>
+              <w:jc w:val="left"/>
             </w:pPr>
             <w:r>
               <w:rPr>
@@ -10289,7 +10141,7 @@
           <w:p>
             <w:pPr>
               <w:pStyle w:val="Compact"/>
-              <w:jc w:val="center"/>
+              <w:jc w:val="left"/>
             </w:pPr>
             <w:r>
               <w:rPr>
@@ -10311,7 +10163,7 @@
           <w:p>
             <w:pPr>
               <w:pStyle w:val="Compact"/>
-              <w:jc w:val="center"/>
+              <w:jc w:val="left"/>
             </w:pPr>
             <w:r>
               <w:rPr>
@@ -10333,7 +10185,7 @@
           <w:p>
             <w:pPr>
               <w:pStyle w:val="Compact"/>
-              <w:jc w:val="center"/>
+              <w:jc w:val="left"/>
             </w:pPr>
             <w:r>
               <w:rPr>
@@ -10390,7 +10242,7 @@
           <w:p>
             <w:pPr>
               <w:pStyle w:val="Compact"/>
-              <w:jc w:val="center"/>
+              <w:jc w:val="left"/>
             </w:pPr>
             <w:r>
               <w:t xml:space="preserve">×</w:t>
@@ -10402,7 +10254,7 @@
           <w:p>
             <w:pPr>
               <w:pStyle w:val="Compact"/>
-              <w:jc w:val="center"/>
+              <w:jc w:val="left"/>
             </w:pPr>
             <w:r>
               <w:t xml:space="preserve">×</w:t>
@@ -10414,7 +10266,7 @@
           <w:p>
             <w:pPr>
               <w:pStyle w:val="Compact"/>
-              <w:jc w:val="center"/>
+              <w:jc w:val="left"/>
             </w:pPr>
             <w:r>
               <w:t xml:space="preserve">×</w:t>
@@ -10426,7 +10278,7 @@
           <w:p>
             <w:pPr>
               <w:pStyle w:val="Compact"/>
-              <w:jc w:val="center"/>
+              <w:jc w:val="left"/>
             </w:pPr>
             <w:r>
               <w:t xml:space="preserve">√</w:t>
@@ -10438,7 +10290,7 @@
           <w:p>
             <w:pPr>
               <w:pStyle w:val="Compact"/>
-              <w:jc w:val="center"/>
+              <w:jc w:val="left"/>
             </w:pPr>
             <w:r>
               <w:t xml:space="preserve">√</w:t>
@@ -10491,7 +10343,7 @@
           <w:p>
             <w:pPr>
               <w:pStyle w:val="Compact"/>
-              <w:jc w:val="center"/>
+              <w:jc w:val="left"/>
             </w:pPr>
             <w:r>
               <w:t xml:space="preserve">×</w:t>
@@ -10503,7 +10355,7 @@
           <w:p>
             <w:pPr>
               <w:pStyle w:val="Compact"/>
-              <w:jc w:val="center"/>
+              <w:jc w:val="left"/>
             </w:pPr>
             <w:r>
               <w:t xml:space="preserve">√</w:t>
@@ -10515,7 +10367,7 @@
           <w:p>
             <w:pPr>
               <w:pStyle w:val="Compact"/>
-              <w:jc w:val="center"/>
+              <w:jc w:val="left"/>
             </w:pPr>
             <w:r>
               <w:t xml:space="preserve">×</w:t>
@@ -10527,7 +10379,7 @@
           <w:p>
             <w:pPr>
               <w:pStyle w:val="Compact"/>
-              <w:jc w:val="center"/>
+              <w:jc w:val="left"/>
             </w:pPr>
             <w:r>
               <w:t xml:space="preserve">√</w:t>
@@ -10539,7 +10391,7 @@
           <w:p>
             <w:pPr>
               <w:pStyle w:val="Compact"/>
-              <w:jc w:val="center"/>
+              <w:jc w:val="left"/>
             </w:pPr>
             <w:r>
               <w:t xml:space="preserve">×</w:t>
@@ -10592,7 +10444,7 @@
           <w:p>
             <w:pPr>
               <w:pStyle w:val="Compact"/>
-              <w:jc w:val="center"/>
+              <w:jc w:val="left"/>
             </w:pPr>
             <w:r>
               <w:t xml:space="preserve">×</w:t>
@@ -10604,7 +10456,7 @@
           <w:p>
             <w:pPr>
               <w:pStyle w:val="Compact"/>
-              <w:jc w:val="center"/>
+              <w:jc w:val="left"/>
             </w:pPr>
             <w:r>
               <w:t xml:space="preserve">×</w:t>
@@ -10616,7 +10468,7 @@
           <w:p>
             <w:pPr>
               <w:pStyle w:val="Compact"/>
-              <w:jc w:val="center"/>
+              <w:jc w:val="left"/>
             </w:pPr>
             <w:r>
               <w:t xml:space="preserve">×</w:t>
@@ -10628,7 +10480,7 @@
           <w:p>
             <w:pPr>
               <w:pStyle w:val="Compact"/>
-              <w:jc w:val="center"/>
+              <w:jc w:val="left"/>
             </w:pPr>
             <w:r>
               <w:t xml:space="preserve">√</w:t>
@@ -10640,7 +10492,7 @@
           <w:p>
             <w:pPr>
               <w:pStyle w:val="Compact"/>
-              <w:jc w:val="center"/>
+              <w:jc w:val="left"/>
             </w:pPr>
             <w:r>
               <w:t xml:space="preserve">√</w:t>
@@ -10693,7 +10545,7 @@
           <w:p>
             <w:pPr>
               <w:pStyle w:val="Compact"/>
-              <w:jc w:val="center"/>
+              <w:jc w:val="left"/>
             </w:pPr>
             <w:r>
               <w:t xml:space="preserve">×</w:t>
@@ -10705,7 +10557,7 @@
           <w:p>
             <w:pPr>
               <w:pStyle w:val="Compact"/>
-              <w:jc w:val="center"/>
+              <w:jc w:val="left"/>
             </w:pPr>
             <w:r>
               <w:t xml:space="preserve">×</w:t>
@@ -10717,7 +10569,7 @@
           <w:p>
             <w:pPr>
               <w:pStyle w:val="Compact"/>
-              <w:jc w:val="center"/>
+              <w:jc w:val="left"/>
             </w:pPr>
             <w:r>
               <w:t xml:space="preserve">×</w:t>
@@ -10729,7 +10581,7 @@
           <w:p>
             <w:pPr>
               <w:pStyle w:val="Compact"/>
-              <w:jc w:val="center"/>
+              <w:jc w:val="left"/>
             </w:pPr>
             <w:r>
               <w:t xml:space="preserve">√</w:t>
@@ -10741,7 +10593,7 @@
           <w:p>
             <w:pPr>
               <w:pStyle w:val="Compact"/>
-              <w:jc w:val="center"/>
+              <w:jc w:val="left"/>
             </w:pPr>
             <w:r>
               <w:t xml:space="preserve">×</w:t>
@@ -10794,7 +10646,7 @@
           <w:p>
             <w:pPr>
               <w:pStyle w:val="Compact"/>
-              <w:jc w:val="center"/>
+              <w:jc w:val="left"/>
             </w:pPr>
             <w:r>
               <w:t xml:space="preserve">×</w:t>
@@ -10806,7 +10658,7 @@
           <w:p>
             <w:pPr>
               <w:pStyle w:val="Compact"/>
-              <w:jc w:val="center"/>
+              <w:jc w:val="left"/>
             </w:pPr>
             <w:r>
               <w:t xml:space="preserve">×</w:t>
@@ -10818,7 +10670,7 @@
           <w:p>
             <w:pPr>
               <w:pStyle w:val="Compact"/>
-              <w:jc w:val="center"/>
+              <w:jc w:val="left"/>
             </w:pPr>
             <w:r>
               <w:t xml:space="preserve">×</w:t>
@@ -10830,7 +10682,7 @@
           <w:p>
             <w:pPr>
               <w:pStyle w:val="Compact"/>
-              <w:jc w:val="center"/>
+              <w:jc w:val="left"/>
             </w:pPr>
             <w:r>
               <w:t xml:space="preserve">√</w:t>
@@ -10842,7 +10694,7 @@
           <w:p>
             <w:pPr>
               <w:pStyle w:val="Compact"/>
-              <w:jc w:val="center"/>
+              <w:jc w:val="left"/>
             </w:pPr>
             <w:r>
               <w:t xml:space="preserve">√</w:t>
@@ -10895,7 +10747,7 @@
           <w:p>
             <w:pPr>
               <w:pStyle w:val="Compact"/>
-              <w:jc w:val="center"/>
+              <w:jc w:val="left"/>
             </w:pPr>
             <w:r>
               <w:t xml:space="preserve">×</w:t>
@@ -10907,7 +10759,7 @@
           <w:p>
             <w:pPr>
               <w:pStyle w:val="Compact"/>
-              <w:jc w:val="center"/>
+              <w:jc w:val="left"/>
             </w:pPr>
             <w:r>
               <w:t xml:space="preserve">×</w:t>
@@ -10919,7 +10771,7 @@
           <w:p>
             <w:pPr>
               <w:pStyle w:val="Compact"/>
-              <w:jc w:val="center"/>
+              <w:jc w:val="left"/>
             </w:pPr>
             <w:r>
               <w:t xml:space="preserve">×</w:t>
@@ -10931,7 +10783,7 @@
           <w:p>
             <w:pPr>
               <w:pStyle w:val="Compact"/>
-              <w:jc w:val="center"/>
+              <w:jc w:val="left"/>
             </w:pPr>
             <w:r>
               <w:t xml:space="preserve">√</w:t>
@@ -10943,7 +10795,7 @@
           <w:p>
             <w:pPr>
               <w:pStyle w:val="Compact"/>
-              <w:jc w:val="center"/>
+              <w:jc w:val="left"/>
             </w:pPr>
             <w:r>
               <w:t xml:space="preserve">√</w:t>
@@ -10996,7 +10848,7 @@
           <w:p>
             <w:pPr>
               <w:pStyle w:val="Compact"/>
-              <w:jc w:val="center"/>
+              <w:jc w:val="left"/>
             </w:pPr>
             <w:r>
               <w:t xml:space="preserve">×</w:t>
@@ -11008,7 +10860,7 @@
           <w:p>
             <w:pPr>
               <w:pStyle w:val="Compact"/>
-              <w:jc w:val="center"/>
+              <w:jc w:val="left"/>
             </w:pPr>
             <w:r>
               <w:t xml:space="preserve">×</w:t>
@@ -11020,7 +10872,7 @@
           <w:p>
             <w:pPr>
               <w:pStyle w:val="Compact"/>
-              <w:jc w:val="center"/>
+              <w:jc w:val="left"/>
             </w:pPr>
             <w:r>
               <w:t xml:space="preserve">×</w:t>
@@ -11032,7 +10884,7 @@
           <w:p>
             <w:pPr>
               <w:pStyle w:val="Compact"/>
-              <w:jc w:val="center"/>
+              <w:jc w:val="left"/>
             </w:pPr>
             <w:r>
               <w:t xml:space="preserve">√</w:t>
@@ -11044,7 +10896,7 @@
           <w:p>
             <w:pPr>
               <w:pStyle w:val="Compact"/>
-              <w:jc w:val="center"/>
+              <w:jc w:val="left"/>
             </w:pPr>
             <w:r>
               <w:t xml:space="preserve">√</w:t>
@@ -11060,9 +10912,6 @@
         <w:pStyle w:val="Heading3"/>
       </w:pPr>
       <w:r>
-        <w:t xml:space="preserve"> </w:t>
-      </w:r>
-      <w:r>
         <w:t xml:space="preserve">2.4.6 Trusted Computing, Secure Execution, and Security Assurance</w:t>
       </w:r>
     </w:p>
@@ -11111,7 +10960,7 @@
         <w:pStyle w:val="TableCaption"/>
       </w:pPr>
       <w:r>
-        <w:t xml:space="preserve">Table 2.9: Descriptions, issues and limitations of the studies on trusted computing and secure execution and their coverage of the key requirements</w:t>
+        <w:t xml:space="preserve">Table 2.9: Descriptions, issues and limitations of the studies on Trusted Computing and secure execution and their coverage of the key requirements</w:t>
       </w:r>
     </w:p>
     <w:tbl>
@@ -11120,17 +10969,17 @@
         <w:tblW w:type="pct" w:w="5000"/>
         <w:tblLayout w:type="fixed"/>
         <w:tblLook w:firstRow="1" w:lastRow="0" w:firstColumn="0" w:lastColumn="0" w:noHBand="0" w:noVBand="0" w:val="0020"/>
-        <w:tblCaption w:val="Table 2.9: Descriptions, issues and limitations of the studies on trusted computing and secure execution and their coverage of the key requirements"/>
+        <w:tblCaption w:val="Table 2.9: Descriptions, issues and limitations of the studies on Trusted Computing and secure execution and their coverage of the key requirements"/>
       </w:tblPr>
       <w:tblGrid>
-        <w:gridCol w:w="728"/>
-        <w:gridCol w:w="2457"/>
-        <w:gridCol w:w="2457"/>
-        <w:gridCol w:w="455"/>
-        <w:gridCol w:w="455"/>
-        <w:gridCol w:w="455"/>
-        <w:gridCol w:w="455"/>
-        <w:gridCol w:w="455"/>
+        <w:gridCol w:w="546"/>
+        <w:gridCol w:w="2321"/>
+        <w:gridCol w:w="2321"/>
+        <w:gridCol w:w="546"/>
+        <w:gridCol w:w="546"/>
+        <w:gridCol w:w="546"/>
+        <w:gridCol w:w="546"/>
+        <w:gridCol w:w="546"/>
       </w:tblGrid>
       <w:tr>
         <w:trPr>
@@ -11214,7 +11063,7 @@
           <w:p>
             <w:pPr>
               <w:pStyle w:val="Compact"/>
-              <w:jc w:val="center"/>
+              <w:jc w:val="left"/>
             </w:pPr>
             <w:r>
               <w:rPr>
@@ -11236,7 +11085,7 @@
           <w:p>
             <w:pPr>
               <w:pStyle w:val="Compact"/>
-              <w:jc w:val="center"/>
+              <w:jc w:val="left"/>
             </w:pPr>
             <w:r>
               <w:rPr>
@@ -11258,7 +11107,7 @@
           <w:p>
             <w:pPr>
               <w:pStyle w:val="Compact"/>
-              <w:jc w:val="center"/>
+              <w:jc w:val="left"/>
             </w:pPr>
             <w:r>
               <w:rPr>
@@ -11280,7 +11129,7 @@
           <w:p>
             <w:pPr>
               <w:pStyle w:val="Compact"/>
-              <w:jc w:val="center"/>
+              <w:jc w:val="left"/>
             </w:pPr>
             <w:r>
               <w:rPr>
@@ -11302,7 +11151,7 @@
           <w:p>
             <w:pPr>
               <w:pStyle w:val="Compact"/>
-              <w:jc w:val="center"/>
+              <w:jc w:val="left"/>
             </w:pPr>
             <w:r>
               <w:rPr>
@@ -11359,7 +11208,7 @@
           <w:p>
             <w:pPr>
               <w:pStyle w:val="Compact"/>
-              <w:jc w:val="center"/>
+              <w:jc w:val="left"/>
             </w:pPr>
             <w:r>
               <w:t xml:space="preserve">×</w:t>
@@ -11371,7 +11220,7 @@
           <w:p>
             <w:pPr>
               <w:pStyle w:val="Compact"/>
-              <w:jc w:val="center"/>
+              <w:jc w:val="left"/>
             </w:pPr>
             <w:r>
               <w:t xml:space="preserve">×</w:t>
@@ -11383,7 +11232,7 @@
           <w:p>
             <w:pPr>
               <w:pStyle w:val="Compact"/>
-              <w:jc w:val="center"/>
+              <w:jc w:val="left"/>
             </w:pPr>
             <w:r>
               <w:t xml:space="preserve">×</w:t>
@@ -11395,7 +11244,7 @@
           <w:p>
             <w:pPr>
               <w:pStyle w:val="Compact"/>
-              <w:jc w:val="center"/>
+              <w:jc w:val="left"/>
             </w:pPr>
             <w:r>
               <w:t xml:space="preserve">×</w:t>
@@ -11407,7 +11256,7 @@
           <w:p>
             <w:pPr>
               <w:pStyle w:val="Compact"/>
-              <w:jc w:val="center"/>
+              <w:jc w:val="left"/>
             </w:pPr>
             <w:r>
               <w:t xml:space="preserve">×</w:t>
@@ -11423,9 +11272,6 @@
         <w:pStyle w:val="Heading3"/>
       </w:pPr>
       <w:r>
-        <w:t xml:space="preserve"> </w:t>
-      </w:r>
-      <w:r>
         <w:t xml:space="preserve">2.4.7 Comparative Analysis of Existing Approaches</w:t>
       </w:r>
     </w:p>
@@ -11464,16 +11310,16 @@
     <w:tbl>
       <w:tblPr>
         <w:tblStyle w:val="Table"/>
-        <w:tblW w:type="pct" w:w="4965"/>
+        <w:tblW w:type="pct" w:w="5000"/>
         <w:tblLayout w:type="fixed"/>
         <w:tblLook w:firstRow="1" w:lastRow="0" w:firstColumn="0" w:lastColumn="0" w:noHBand="0" w:noVBand="0" w:val="0020"/>
         <w:tblCaption w:val="Table 2.10: Comparison of the existing research streams and the proposed framework"/>
       </w:tblPr>
       <w:tblGrid>
-        <w:gridCol w:w="1445"/>
-        <w:gridCol w:w="2806"/>
-        <w:gridCol w:w="2695"/>
-        <w:gridCol w:w="917"/>
+        <w:gridCol w:w="2117"/>
+        <w:gridCol w:w="2160"/>
+        <w:gridCol w:w="2160"/>
+        <w:gridCol w:w="1482"/>
       </w:tblGrid>
       <w:tr>
         <w:trPr>
@@ -11961,19 +11807,7 @@
         <w:pStyle w:val="Heading2"/>
       </w:pPr>
       <w:r>
-        <w:t xml:space="preserve"> </w:t>
-      </w:r>
-      <w:r>
-        <w:t xml:space="preserve">2.5</w:t>
-      </w:r>
-      <w:r>
-        <w:t xml:space="preserve"> </w:t>
-      </w:r>
-      <w:r>
-        <w:t xml:space="preserve"> </w:t>
-      </w:r>
-      <w:r>
-        <w:t xml:space="preserve">Research Gaps in the Existing Studies from the Requirement Perspective</w:t>
+        <w:t xml:space="preserve">2.5 Research Gaps in the Existing Studies from the Requirement Perspective</w:t>
       </w:r>
     </w:p>
     <w:p>
@@ -12110,7 +11944,7 @@
         <w:pStyle w:val="FirstParagraph"/>
       </w:pPr>
       <w:r>
-        <w:t xml:space="preserve">These gaps are addressed in the following order by the research objectives of Chapter 3: RO1 (Req 1), RO2 (Req 2), RO3 (Req 3), RO4 (Req 4) and RO5 (Req 5), with RO6 providing the formal and empirical validation of the resulting decisions.</w:t>
+        <w:t xml:space="preserve">These gaps are addressed in the following order by the research objectives of Chapter 4: RO1 (Req 1), RO2 (Req 2), RO3 (Req 3), RO4 (Req 4) and RO5 (Req 5), with RO6 providing the formal and empirical validation of the resulting decisions.</w:t>
       </w:r>
     </w:p>
     <w:p>
@@ -12534,7 +12368,7 @@
         <w:pStyle w:val="BodyText"/>
       </w:pPr>
       <w:r>
-        <w:t xml:space="preserve">These findings motivate the research questions and objectives presented in the next chapter and the trust-oriented consent authorisation framework proposed in Chapters 5 and 6, in which decentralised identifiers, verifiable credentials, threshold-based approval and policy evaluation contribute to one explainable decision.</w:t>
+        <w:t xml:space="preserve">These findings motivate the research questions and objectives presented in Chapters 3 and 4 and the trust-oriented consent authorisation framework proposed in Chapters 5 and 6, in which decentralised identifiers, verifiable credentials, threshold-based approval and policy evaluation contribute to one explainable decision.</w:t>
       </w:r>
     </w:p>
     <w:bookmarkEnd w:id="43"/>
@@ -12570,7 +12404,7 @@
         <w:pStyle w:val="BodyText"/>
       </w:pPr>
       <w:r>
-        <w:t xml:space="preserve">In particular, the review defined five key requirements for a trust-oriented consent authorisation framework (Section 2.2) and assessed each of the 28 shortlisted studies against them (Tables 2.4–2.9). No study satisfies more than three of the five requirements, and none treats consent as an evaluable object (Req 1) while also providing multi-party threshold authorisation (Req 3); the gaps are stated requirement by requirement in Section 2.5.</w:t>
+        <w:t xml:space="preserve">In particular, the review defined five key requirements for a trust-oriented consent authorisation framework (Section 2.2) and assessed each of the 33 shortlisted studies against them (Tables 2.4–2.9). No study satisfies more than three of the five requirements, and none treats consent as an evaluable object (Req 1) while also providing multi-party threshold authorisation (Req 3); the gaps are stated requirement by requirement in Section 2.5.</w:t>
       </w:r>
     </w:p>
     <w:p>
@@ -14088,11 +13922,17 @@
         <w:t xml:space="preserve">s</w:t>
       </w:r>
       <w:r>
+        <w:t xml:space="preserve">,</w:t>
+      </w:r>
+      <w:r>
+        <w:t xml:space="preserve"> </w:t>
+      </w:r>
+      <w:r>
         <w:rPr>
           <w:i/>
           <w:iCs/>
         </w:rPr>
-        <w:t xml:space="preserve">, t</w:t>
+        <w:t xml:space="preserve">t</w:t>
       </w:r>
       <w:r>
         <w:rPr>
@@ -16728,7 +16568,7 @@
         <w:pStyle w:val="BodyText"/>
       </w:pPr>
       <w:r>
-        <w:t xml:space="preserve">The research questions form a progressive research architecture that begins with establishing a robust Consent Representation, which directly fosters Participant Trust. This trust then translates into a framework for Collective Authorisation, providing the necessary foundation for systemic Policy Enforcement. Consequently, this enables dynamic Temporal/Lifecycle Control over data and processes, culminating in comprehensive Security Assurance and Validation. By structuring the inquiries this way, the architecture creates a continuous logical pipeline that connects user-facing trust with back-end system security.</w:t>
+        <w:t xml:space="preserve">The research questions form a progressive research architecture that begins with establishing a consent representation, which directly fosters participant trust. This trust then translates into a framework for collective authorisation, providing the necessary foundation for policy enforcement. Consequently, this enables dynamic temporal and lifecycle control over data and processes, culminating in security assurance and validation.</w:t>
       </w:r>
     </w:p>
     <w:p>
@@ -16984,7 +16824,7 @@
         <w:pStyle w:val="BodyText"/>
       </w:pPr>
       <w:r>
-        <w:t xml:space="preserve">Each objective also responds to one of the key requirements identified in the literature review: RO1 to Req 1, RO2 to Req 2, RO3 to Req 3, RO4 to Req 4 and RO5 to Req 5 (Section 2.2), while RO6 provides the formal and empirical assurance that the requirements are met (Section 2.5).</w:t>
+        <w:t xml:space="preserve">Each objective also responds to one of the key requirements identified in the literature review: RO1 to Req 1, RO2 to Req 2, RO3 to Req 3, RO4 to Req 4, and RO5 to Req 5 (Section 2.2), while RO6 provides the formal and empirical assurance that the requirements are met (Section 2.5).</w:t>
       </w:r>
     </w:p>
     <w:p>
@@ -17327,7 +17167,7 @@
         <w:pStyle w:val="TableCaption"/>
       </w:pPr>
       <w:r>
-        <w:t xml:space="preserve">Table 4.2: Research Questions, Research Objectives, and Thesis Chapters (continued: RQ4 current stage; RQ5–RQ6 CA3)</w:t>
+        <w:t xml:space="preserve">Table 4.2: Research Questions, Research Objectives, and Thesis Chapters (continued: SRQ4 current stage; SRQ5–SRQ6 CA3)</w:t>
       </w:r>
     </w:p>
     <w:tbl>
@@ -17336,7 +17176,7 @@
         <w:tblW w:type="pct" w:w="5000"/>
         <w:tblLayout w:type="fixed"/>
         <w:tblLook w:firstRow="1" w:lastRow="0" w:firstColumn="0" w:lastColumn="0" w:noHBand="0" w:noVBand="0" w:val="0020"/>
-        <w:tblCaption w:val="Table 4.2: Research Questions, Research Objectives, and Thesis Chapters (continued: RQ4 current stage; RQ5–RQ6 CA3)"/>
+        <w:tblCaption w:val="Table 4.2: Research Questions, Research Objectives, and Thesis Chapters (continued: SRQ4 current stage; SRQ5–SRQ6 CA3)"/>
       </w:tblPr>
       <w:tblGrid>
         <w:gridCol w:w="754"/>
@@ -17653,7 +17493,7 @@
         <w:pStyle w:val="BodyText"/>
       </w:pPr>
       <w:r>
-        <w:t xml:space="preserve">For the foundational current stage model, the authorisation decision is given by Eq. (6),</w:t>
+        <w:t xml:space="preserve">For the foundational current stage model, the authorisation decision is given by Eq. (6).</w:t>
       </w:r>
     </w:p>
     <w:p>
@@ -17661,7 +17501,7 @@
         <w:pStyle w:val="BodyText"/>
       </w:pPr>
       <w:r>
-        <w:t xml:space="preserve">where</w:t>
+        <w:t xml:space="preserve">In Eq. (6),</w:t>
       </w:r>
       <w:r>
         <w:t xml:space="preserve"> </w:t>
@@ -17756,7 +17596,7 @@
         <w:pStyle w:val="BodyText"/>
       </w:pPr>
       <w:r>
-        <w:t xml:space="preserve">The next stage research will extend this decision model by incorporating temporal and lifecycle conditions, as given by Eq. (24),</w:t>
+        <w:t xml:space="preserve">The next stage research will extend this decision model by incorporating temporal and lifecycle conditions, as given by Eq. (24).</w:t>
       </w:r>
     </w:p>
     <w:p>
@@ -17764,7 +17604,7 @@
         <w:pStyle w:val="BodyText"/>
       </w:pPr>
       <w:r>
-        <w:t xml:space="preserve">where</w:t>
+        <w:t xml:space="preserve">In Eq. (24),</w:t>
       </w:r>
       <w:r>
         <w:t xml:space="preserve"> </w:t>
@@ -17822,7 +17662,7 @@
         <w:t xml:space="preserve">C</w:t>
       </w:r>
       <w:r>
-        <w:t xml:space="preserve">) represents the validity of the consent lifecycle state and its transitions. This extension provides a consistent connection between the foundational current stage objectives and the planned next research on dynamic trust, formal assurance, and comprehensive validation.</w:t>
+        <w:t xml:space="preserve">) represents the validity of the consent lifecycle state and its transitions. This extension provides a consistent connection between the foundational current stage objectives and the planned next-stage research on dynamic trust, formal assurance, and comprehensive validation.</w:t>
       </w:r>
     </w:p>
     <w:bookmarkEnd w:id="62"/>
@@ -17936,7 +17776,10 @@
           <w:i/>
           <w:iCs/>
         </w:rPr>
-        <w:t xml:space="preserve">how stakeholders</w:t>
+        <w:t xml:space="preserve">how stakeholders interact with it</w:t>
+      </w:r>
+      <w:r>
+        <w:t xml:space="preserve">, and</w:t>
       </w:r>
       <w:r>
         <w:t xml:space="preserve"> </w:t>
@@ -17946,10 +17789,35 @@
           <w:i/>
           <w:iCs/>
         </w:rPr>
-        <w:t xml:space="preserve">interact with it</w:t>
-      </w:r>
-      <w:r>
-        <w:t xml:space="preserve">, and</w:t>
+        <w:t xml:space="preserve">how trust is enforced</w:t>
+      </w:r>
+      <w:r>
+        <w:t xml:space="preserve">.</w:t>
+      </w:r>
+    </w:p>
+    <w:bookmarkStart w:id="77" w:name="X4c5c546815ea228e4b76521fee5c855eb2a3a8b"/>
+    <w:p>
+      <w:pPr>
+        <w:pStyle w:val="Heading2"/>
+      </w:pPr>
+      <w:r>
+        <w:t xml:space="preserve">5.1 MVC Layered Architecture and Component Decomposition</w:t>
+      </w:r>
+    </w:p>
+    <w:p>
+      <w:pPr>
+        <w:pStyle w:val="FirstParagraph"/>
+      </w:pPr>
+      <w:r>
+        <w:t xml:space="preserve">The proposed HALAH framework adopts a layered Model–View–Controller (MVC) architecture to provide a clear separation between consent representation, stakeholder interaction, and security-critical authorisation enforcement. The purpose of this architectural decomposition is not simply to follow a conventional software engineering pattern, but to establish explicit boundaries between the information that represents trust, the interfaces through which participants express their actions, and the mechanisms that determine whether those actions should result in an authorisation decision.</w:t>
+      </w:r>
+    </w:p>
+    <w:p>
+      <w:pPr>
+        <w:pStyle w:val="BodyText"/>
+      </w:pPr>
+      <w:r>
+        <w:t xml:space="preserve">At the highest level, the architecture consists of three complementary layers: the</w:t>
       </w:r>
       <w:r>
         <w:t xml:space="preserve"> </w:t>
@@ -17959,55 +17827,7 @@
           <w:i/>
           <w:iCs/>
         </w:rPr>
-        <w:t xml:space="preserve">how trust is enforced</w:t>
-      </w:r>
-      <w:r>
-        <w:t xml:space="preserve">.</w:t>
-      </w:r>
-    </w:p>
-    <w:bookmarkStart w:id="77" w:name="X4c5c546815ea228e4b76521fee5c855eb2a3a8b"/>
-    <w:p>
-      <w:pPr>
-        <w:pStyle w:val="Heading2"/>
-      </w:pPr>
-      <w:r>
-        <w:t xml:space="preserve">5.1 MVC Layered Architecture and Component Decomposition</w:t>
-      </w:r>
-    </w:p>
-    <w:p>
-      <w:pPr>
-        <w:pStyle w:val="FirstParagraph"/>
-      </w:pPr>
-      <w:r>
-        <w:t xml:space="preserve">The proposed HALAH framework adopts a layered Model–View–Controller (MVC) architecture to provide a clear separation between consent representation, stakeholder interaction, and security-critical authorisation enforcement. The purpose of this architectural decomposition is not simply to follow a conventional software engineering pattern, but to establish explicit boundaries between the information that represents trust, the interfaces through which participants express their actions, and the mechanisms that determine whether those actions should result in an authorisation decision.</w:t>
-      </w:r>
-    </w:p>
-    <w:p>
-      <w:pPr>
-        <w:pStyle w:val="BodyText"/>
-      </w:pPr>
-      <w:r>
-        <w:t xml:space="preserve">At the highest level, the architecture consists of three complementary layers: the</w:t>
-      </w:r>
-      <w:r>
-        <w:t xml:space="preserve"> </w:t>
-      </w:r>
-      <w:r>
-        <w:rPr>
-          <w:i/>
-          <w:iCs/>
-        </w:rPr>
-        <w:t xml:space="preserve">View</w:t>
-      </w:r>
-      <w:r>
-        <w:t xml:space="preserve"> </w:t>
-      </w:r>
-      <w:r>
-        <w:rPr>
-          <w:i/>
-          <w:iCs/>
-        </w:rPr>
-        <w:t xml:space="preserve">Layer</w:t>
+        <w:t xml:space="preserve">View Layer</w:t>
       </w:r>
       <w:r>
         <w:t xml:space="preserve">, the</w:t>
@@ -18277,7 +18097,13 @@
           <w:i/>
           <w:iCs/>
         </w:rPr>
-        <w:t xml:space="preserve">Decision</w:t>
+        <w:t xml:space="preserve">Decision Engine</w:t>
+      </w:r>
+      <w:r>
+        <w:t xml:space="preserve"> </w:t>
+      </w:r>
+      <w:r>
+        <w:t xml:space="preserve">combines the resulting predicates into the final authorisation decision. Finally,</w:t>
       </w:r>
       <w:r>
         <w:t xml:space="preserve"> </w:t>
@@ -18287,33 +18113,7 @@
           <w:i/>
           <w:iCs/>
         </w:rPr>
-        <w:t xml:space="preserve">Engine</w:t>
-      </w:r>
-      <w:r>
-        <w:t xml:space="preserve"> </w:t>
-      </w:r>
-      <w:r>
-        <w:t xml:space="preserve">combines the resulting predicates into the final authorisation decision. Finally,</w:t>
-      </w:r>
-      <w:r>
-        <w:t xml:space="preserve"> </w:t>
-      </w:r>
-      <w:r>
-        <w:rPr>
-          <w:i/>
-          <w:iCs/>
-        </w:rPr>
-        <w:t xml:space="preserve">Audit</w:t>
-      </w:r>
-      <w:r>
-        <w:t xml:space="preserve"> </w:t>
-      </w:r>
-      <w:r>
-        <w:rPr>
-          <w:i/>
-          <w:iCs/>
-        </w:rPr>
-        <w:t xml:space="preserve">Coordination</w:t>
+        <w:t xml:space="preserve">Audit Coordination</w:t>
       </w:r>
       <w:r>
         <w:t xml:space="preserve"> </w:t>
@@ -18700,7 +18500,7 @@
         <w:pStyle w:val="BodyText"/>
       </w:pPr>
       <w:r>
-        <w:t xml:space="preserve">The relationship can therefore be summarised as follows</w:t>
+        <w:t xml:space="preserve">The relationship can therefore be summarised as follows:</w:t>
       </w:r>
     </w:p>
     <w:p>
@@ -19628,7 +19428,7 @@
         <w:t xml:space="preserve"> </w:t>
       </w:r>
       <w:r>
-        <w:t xml:space="preserve">(Eq. (7)),</w:t>
+        <w:t xml:space="preserve">(Eq. (7)).</w:t>
       </w:r>
     </w:p>
     <w:p>
@@ -19636,7 +19436,7 @@
         <w:pStyle w:val="BodyText"/>
       </w:pPr>
       <w:r>
-        <w:t xml:space="preserve">where</w:t>
+        <w:t xml:space="preserve">In Eq. (7),</w:t>
       </w:r>
       <w:r>
         <w:t xml:space="preserve"> </w:t>
@@ -19947,7 +19747,7 @@
         <w:pStyle w:val="FirstParagraph"/>
       </w:pPr>
       <w:r>
-        <w:t xml:space="preserve">If the requested data exceeds the authorised scope, the request must be rejected even if the requester has successfully authenticated and the required number of participants has approved the consent.</w:t>
+        <w:t xml:space="preserve">If the requested data exceed the authorised scope, the request must be rejected even if the requester has successfully authenticated and the required number of participants has approved the consent.</w:t>
       </w:r>
     </w:p>
     <w:p>
@@ -20055,7 +19855,52 @@
           <w:i/>
           <w:iCs/>
         </w:rPr>
-        <w:t xml:space="preserve">input to the</w:t>
+        <w:t xml:space="preserve">input to the authorisation process</w:t>
+      </w:r>
+      <w:r>
+        <w:t xml:space="preserve">, rather than an authorisation decision itself. The actual security decision remains the responsibility of the Controller.</w:t>
+      </w:r>
+    </w:p>
+    <w:p>
+      <w:pPr>
+        <w:pStyle w:val="BodyText"/>
+      </w:pPr>
+      <w:r>
+        <w:t xml:space="preserve">This distinction is particularly important in decentralised environments where different stakeholders may not fully trust one another. The proposed architecture therefore treats each user action as a claim that must be independently evaluated rather than as an automatically trusted system operation.</w:t>
+      </w:r>
+    </w:p>
+    <w:bookmarkEnd w:id="83"/>
+    <w:bookmarkStart w:id="84" w:name="X29a124864d396411eac11d932965b7ef7582ae4"/>
+    <w:p>
+      <w:pPr>
+        <w:pStyle w:val="Heading2"/>
+      </w:pPr>
+      <w:r>
+        <w:t xml:space="preserve">5.5 Controller: Trusted Multi-Party Authorisation Enforcement</w:t>
+      </w:r>
+    </w:p>
+    <w:p>
+      <w:pPr>
+        <w:pStyle w:val="FirstParagraph"/>
+      </w:pPr>
+      <w:r>
+        <w:t xml:space="preserve">The Controller represents the central decision coordination mechanism of the proposed framework. Its responsibility is to transform consent specifications, participant credentials, approval evidence, and access requests into a deterministic authorisation decision.</w:t>
+      </w:r>
+    </w:p>
+    <w:p>
+      <w:pPr>
+        <w:pStyle w:val="BodyText"/>
+      </w:pPr>
+      <w:r>
+        <w:t xml:space="preserve">The Controller first evaluates whether the requesting entity and relevant authorisation participants possess valid identities and credentials. Identity verification is given by Eq. (8),</w:t>
+      </w:r>
+    </w:p>
+    <w:p>
+      <w:pPr>
+        <w:pStyle w:val="BodyText"/>
+      </w:pPr>
+      <w:r>
+        <w:t xml:space="preserve">where</w:t>
       </w:r>
       <w:r>
         <w:t xml:space="preserve"> </w:t>
@@ -20065,65 +19910,23 @@
           <w:i/>
           <w:iCs/>
         </w:rPr>
-        <w:t xml:space="preserve">authorisation process</w:t>
-      </w:r>
-      <w:r>
-        <w:t xml:space="preserve">, rather than an authorisation decision itself. The actual security decision remains the responsibility of the Controller.</w:t>
-      </w:r>
-    </w:p>
-    <w:p>
-      <w:pPr>
-        <w:pStyle w:val="BodyText"/>
-      </w:pPr>
-      <w:r>
-        <w:t xml:space="preserve">This distinction is particularly important in decentralised environments where different stakeholders may not fully trust one another. The proposed architecture therefore treats each user action as a claim that must be independently evaluated rather than as an automatically trusted system operation.</w:t>
-      </w:r>
-    </w:p>
-    <w:bookmarkEnd w:id="83"/>
-    <w:bookmarkStart w:id="84" w:name="X29a124864d396411eac11d932965b7ef7582ae4"/>
-    <w:p>
-      <w:pPr>
-        <w:pStyle w:val="Heading2"/>
-      </w:pPr>
-      <w:r>
-        <w:t xml:space="preserve">5.5 Controller: Trusted Multi-Party Authorisation Enforcement</w:t>
-      </w:r>
-    </w:p>
-    <w:p>
-      <w:pPr>
-        <w:pStyle w:val="FirstParagraph"/>
-      </w:pPr>
-      <w:r>
-        <w:t xml:space="preserve">The Controller represents the central decision coordination mechanism of the proposed framework. Its responsibility is to transform consent specifications, participant credentials, approval evidence, and access requests into a deterministic authorisation decision.</w:t>
-      </w:r>
-    </w:p>
-    <w:p>
-      <w:pPr>
-        <w:pStyle w:val="BodyText"/>
-      </w:pPr>
-      <w:r>
-        <w:t xml:space="preserve">The Controller first evaluates whether the requesting entity and relevant authorisation participants possess valid identities and credentials. Identity verification is given by Eq. (8),</w:t>
-      </w:r>
-    </w:p>
-    <w:p>
-      <w:pPr>
-        <w:pStyle w:val="BodyText"/>
-      </w:pPr>
-      <w:r>
-        <w:t xml:space="preserve">where</w:t>
-      </w:r>
-      <w:r>
-        <w:t xml:space="preserve"> </w:t>
+        <w:t xml:space="preserve">VerifyDID</w:t>
+      </w:r>
+      <w:r>
+        <w:t xml:space="preserve">(</w:t>
       </w:r>
       <w:r>
         <w:rPr>
           <w:i/>
           <w:iCs/>
         </w:rPr>
-        <w:t xml:space="preserve">VerifyDID</w:t>
-      </w:r>
-      <w:r>
-        <w:t xml:space="preserve">(</w:t>
+        <w:t xml:space="preserve">u</w:t>
+      </w:r>
+      <w:r>
+        <w:t xml:space="preserve">) determines whether the decentralised identity of participant</w:t>
+      </w:r>
+      <w:r>
+        <w:t xml:space="preserve"> </w:t>
       </w:r>
       <w:r>
         <w:rPr>
@@ -20133,7 +19936,10 @@
         <w:t xml:space="preserve">u</w:t>
       </w:r>
       <w:r>
-        <w:t xml:space="preserve">) determines whether the decentralised identity of participant</w:t>
+        <w:t xml:space="preserve"> </w:t>
+      </w:r>
+      <w:r>
+        <w:t xml:space="preserve">can be verified and</w:t>
       </w:r>
       <w:r>
         <w:t xml:space="preserve"> </w:t>
@@ -20143,32 +19949,16 @@
           <w:i/>
           <w:iCs/>
         </w:rPr>
-        <w:t xml:space="preserve">u</w:t>
-      </w:r>
-      <w:r>
-        <w:t xml:space="preserve"> </w:t>
-      </w:r>
-      <w:r>
-        <w:t xml:space="preserve">can be verified and</w:t>
-      </w:r>
-      <w:r>
-        <w:t xml:space="preserve"> </w:t>
+        <w:t xml:space="preserve">VerifyVC</w:t>
+      </w:r>
+      <w:r>
+        <w:t xml:space="preserve">(</w:t>
       </w:r>
       <w:r>
         <w:rPr>
           <w:i/>
           <w:iCs/>
         </w:rPr>
-        <w:t xml:space="preserve">VerifyVC</w:t>
-      </w:r>
-      <w:r>
-        <w:t xml:space="preserve">(</w:t>
-      </w:r>
-      <w:r>
-        <w:rPr>
-          <w:i/>
-          <w:iCs/>
-        </w:rPr>
         <w:t xml:space="preserve">u</w:t>
       </w:r>
       <w:r>
@@ -20196,7 +19986,7 @@
         <w:pStyle w:val="BodyText"/>
       </w:pPr>
       <w:r>
-        <w:t xml:space="preserve">After identity and authority conditions have been evaluated, the Controller determines whether the multi-party authorisation requirements associated with the consent object have been satisfied. Only independently verified participants can contribute to the authorisation evidence set</w:t>
+        <w:t xml:space="preserve">After identity and authority conditions have been evaluated, the Controller determines whether the multi-party authorisation requirements associated with the consent object have been satisfied. Only independently verified participants can contribute to the verified approval set</w:t>
       </w:r>
       <w:r>
         <w:t xml:space="preserve"> </w:t>
@@ -20769,17 +20559,7 @@
           <w:i/>
           <w:iCs/>
         </w:rPr>
-        <w:t xml:space="preserve">approval</w:t>
-      </w:r>
-      <w:r>
-        <w:t xml:space="preserve"> </w:t>
-      </w:r>
-      <w:r>
-        <w:rPr>
-          <w:i/>
-          <w:iCs/>
-        </w:rPr>
-        <w:t xml:space="preserve">validity</w:t>
+        <w:t xml:space="preserve">approval validity</w:t>
       </w:r>
       <w:r>
         <w:t xml:space="preserve"> </w:t>
@@ -21302,7 +21082,7 @@
           <w:i/>
           <w:iCs/>
         </w:rPr>
-        <w:t xml:space="preserve">collective authorisation integrity</w:t>
+        <w:t xml:space="preserve">multi-party authorisation integrity</w:t>
       </w:r>
       <w:r>
         <w:t xml:space="preserve">. Sensitive healthcare data access can be configured to require multiple independently verified participants. Therefore, a single participant cannot unilaterally activate access when the defined authorisation threshold has not been reached.</w:t>
@@ -21344,7 +21124,7 @@
           <w:i/>
           <w:iCs/>
         </w:rPr>
-        <w:t xml:space="preserve">decision accountability</w:t>
+        <w:t xml:space="preserve">authorisation evidence</w:t>
       </w:r>
       <w:r>
         <w:t xml:space="preserve">. The system maintains evidence concerning the conditions that produced an authorisation decision, thereby supporting auditing and subsequent verification. These properties can be summarised as shown in Table 5.1.</w:t>
@@ -21373,7 +21153,7 @@
         <w:pStyle w:val="BodyText"/>
       </w:pPr>
       <w:r>
-        <w:t xml:space="preserve">As shown in Table 5.2, the View provides the operational environment through which these mechanisms are exercised by independent participants. Importantly, the View does not determine whether an operation is authorised. Instead, it captures participant actions and forwards them to the Controller, which evaluates the security predicates defined by the Model.</w:t>
+        <w:t xml:space="preserve">This mapping is summarised in Table 5.2. The View provides the operational environment through which these mechanisms are exercised by independent participants. Importantly, the View does not determine whether an operation is authorised. Instead, it captures participant actions and forwards them to the Controller, which evaluates the security predicates defined by the Model.</w:t>
       </w:r>
     </w:p>
     <w:bookmarkEnd w:id="89"/>
@@ -22289,7 +22069,7 @@
         <w:t xml:space="preserve"> </w:t>
       </w:r>
       <w:r>
-        <w:t xml:space="preserve">(Eq. (7)),</w:t>
+        <w:t xml:space="preserve">(Eq. (7)).</w:t>
       </w:r>
     </w:p>
     <w:p>
@@ -22297,7 +22077,7 @@
         <w:pStyle w:val="BodyText"/>
       </w:pPr>
       <w:r>
-        <w:t xml:space="preserve">where</w:t>
+        <w:t xml:space="preserve">In Eq. (7),</w:t>
       </w:r>
       <w:r>
         <w:t xml:space="preserve"> </w:t>
@@ -22386,7 +22166,7 @@
         <w:pStyle w:val="FirstParagraph"/>
       </w:pPr>
       <w:r>
-        <w:t xml:space="preserve">The following workflow(Figure 6.1) describes the creation of a trust-aware consent object. The process begins with a patient request and ends with a structured consent record that can be verified by subsequent authorisation services.</w:t>
+        <w:t xml:space="preserve">The following workflow (Figure 6.1) describes the creation of a trust-aware consent object. The process begins with a patient request and ends with a structured consent record that can be verified by subsequent authorisation services.</w:t>
       </w:r>
     </w:p>
     <w:p>
@@ -22854,11 +22634,17 @@
         <w:t xml:space="preserve"> </w:t>
       </w:r>
       <w:r>
+        <w:t xml:space="preserve">&gt;</w:t>
+      </w:r>
+      <w:r>
+        <w:t xml:space="preserve"> </w:t>
+      </w:r>
+      <w:r>
         <w:rPr>
           <w:i/>
           <w:iCs/>
         </w:rPr>
-        <w:t xml:space="preserve">&gt; t</w:t>
+        <w:t xml:space="preserve">t</w:t>
       </w:r>
       <w:r>
         <w:rPr>
@@ -23428,13 +23214,10 @@
           <w:i/>
           <w:iCs/>
         </w:rPr>
-        <w:t xml:space="preserve">E.</w:t>
-      </w:r>
-      <w:r>
-        <w:t xml:space="preserve"> </w:t>
-      </w:r>
-      <w:r>
-        <w:t xml:space="preserve">This sequence ensures that consent is created only after the relevant identity, authority, purpose, scope, and temporal constraints have been validated. Consequently, the resulting consent object serves not merely as a record of patient preference, but as a structured authorisation artefact that can provide evidence for subsequent healthcare data-access decisions.</w:t>
+        <w:t xml:space="preserve">E</w:t>
+      </w:r>
+      <w:r>
+        <w:t xml:space="preserve">. This sequence ensures that consent is created only after the relevant identity, authority, purpose, scope, and temporal constraints have been validated. Consequently, the resulting consent object serves not merely as a record of patient preference, but as a structured authorisation artefact that can provide evidence for subsequent healthcare data-access decisions.</w:t>
       </w:r>
     </w:p>
     <w:p>
@@ -23443,6 +23226,16 @@
       </w:pPr>
       <w:r>
         <w:t xml:space="preserve">In the HALAH prototype (Section 7.2), Steps 1–3 currently perform a syntactic DID check, and credential-based authority validation is scheduled for Stage 2. Step 6 is implemented: the patient interface rejects an expiry time that is not later than the start time.</w:t>
+      </w:r>
+    </w:p>
+    <w:bookmarkEnd w:id="96"/>
+    <w:bookmarkStart w:id="97" w:name="algorithm-1-trust-aware-consent-creation"/>
+    <w:p>
+      <w:pPr>
+        <w:pStyle w:val="Heading3"/>
+      </w:pPr>
+      <w:r>
+        <w:t xml:space="preserve">6.1.3 Algorithm 1: Trust-Aware Consent Creation</w:t>
       </w:r>
     </w:p>
     <w:p>
@@ -24090,19 +23883,9 @@
         </m:r>
       </m:oMath>
     </w:p>
-    <w:bookmarkEnd w:id="96"/>
-    <w:bookmarkStart w:id="97" w:name="algorithm-1-trust-aware-consent-creation"/>
-    <w:p>
-      <w:pPr>
-        <w:pStyle w:val="Heading3"/>
-      </w:pPr>
-      <w:r>
-        <w:t xml:space="preserve">6.1.3 Algorithm 1: Trust-Aware Consent Creation</w:t>
-      </w:r>
-    </w:p>
-    <w:p>
-      <w:pPr>
-        <w:pStyle w:val="FirstParagraph"/>
+    <w:p>
+      <w:pPr>
+        <w:pStyle w:val="BodyText"/>
       </w:pPr>
       <w:r>
         <w:t xml:space="preserve">Algorithm 1 formalises the creation process. The algorithm does not grant data access directly. Instead, it creates a consent object that can later be evaluated by the authorisation mechanism. This distinction is important because the research treats consent as a structured policy-bound object rather than as a simple Boolean permission.</w:t>
@@ -24187,7 +23970,7 @@
         <w:pStyle w:val="BodyText"/>
       </w:pPr>
       <w:r>
-        <w:t xml:space="preserve">A valid DID provides an identity reference, while a valid VC provides evidence associated with a participant’s role, authority, or other relevant attribute. Neither mechanism should automatically grant access to patient data. Instead, the verified identity and authority information become inputs to the subsequent authorisation process. The identity verification condition is given by Eq. (8),</w:t>
+        <w:t xml:space="preserve">A valid DID provides an identity reference, while a valid VC provides evidence associated with a participant’s role, authority, or other relevant attribute. Neither mechanism should automatically grant access to patient data. Instead, the verified identity and authority information become inputs to the subsequent authorisation process. The identity verification condition is given by Eq. (8).</w:t>
       </w:r>
     </w:p>
     <w:p>
@@ -24195,7 +23978,7 @@
         <w:pStyle w:val="BodyText"/>
       </w:pPr>
       <w:r>
-        <w:t xml:space="preserve">where</w:t>
+        <w:t xml:space="preserve">In Eq. (8),</w:t>
       </w:r>
       <w:r>
         <w:t xml:space="preserve"> </w:t>
@@ -26720,7 +26503,7 @@
         <w:pStyle w:val="BodyText"/>
       </w:pPr>
       <w:r>
-        <w:t xml:space="preserve">In the HALAH prototype, the Guardian workflow (Figure 7.2, Section 7.3) verifies each guardian’s EIP-712 approval signature, refuses a second approval from the same guardian, adds the guardian DID to the consent’s signature set and displays the approval count against the threshold (e.g., 2/2). When the threshold is reached, a Soulbound Token (SBT) identifier is assigned, a MINT_SBT event is written to the audit log, and the consent is anchored on the Ethereum Sepolia testnet by minting a non-transferable consent token. Four such mints, made with the v2 consent contract, are recorded in Table 7.4; the v3 contract adds on-chain validity checks and ERC-5484 consensual burn [43].</w:t>
+        <w:t xml:space="preserve">In the HALAH prototype, the guardian workflow (Figure 7.2, Section 7.3) verifies each guardian’s EIP-712 approval signature, refuses a second approval from the same guardian, adds the guardian DID to the consent’s signature set and displays the approval count against the threshold (e.g., 2/2). When the threshold is reached, a Soulbound Token (SBT) identifier is assigned, a MINT_SBT event is written to the audit log, and the consent is anchored on the Ethereum Sepolia testnet by minting a non-transferable consent token. Four such mints, made with the v2 consent contract, are recorded in Table 7.4; the v3 contract adds on-chain validity checks and ERC-5484 consensual burn [43].</w:t>
       </w:r>
     </w:p>
     <w:p>
@@ -27250,10 +27033,7 @@
         <w:t xml:space="preserve">v</w:t>
       </w:r>
       <w:r>
-        <w:t xml:space="preserve"> </w:t>
-      </w:r>
-      <w:r>
-        <w:t xml:space="preserve">that</w:t>
+        <w:t xml:space="preserve">,</w:t>
       </w:r>
     </w:p>
     <w:p>
@@ -30109,7 +29889,7 @@
         <w:pStyle w:val="BodyText"/>
       </w:pPr>
       <w:r>
-        <w:t xml:space="preserve">The HALAH implementation provides a concrete basis for this objective. The Doctor interface retrieves a consent, evaluates its state, allows a requested scope to be selected from the consent scope, generates a proof, checks the requested scope, and invokes the authorisation function before returning data. This behaviour is shown in Figures 7.3–7.4 (Section 7.4).</w:t>
+        <w:t xml:space="preserve">The HALAH implementation provides a concrete basis for this objective. The doctor interface retrieves a consent, evaluates its state, allows a requested scope to be selected from the consent scope, generates a proof, checks the requested scope, and invokes the authorisation function before returning data. This behaviour is shown in Figures 7.3–7.4 (Section 7.4).</w:t>
       </w:r>
     </w:p>
     <w:p>
@@ -30210,7 +29990,7 @@
         <w:t xml:space="preserve"> </w:t>
       </w:r>
       <w:r>
-        <w:t xml:space="preserve">is enforced: the Doctor interface offers only modules from the consented scope, and the service layer independently verifies</w:t>
+        <w:t xml:space="preserve">is enforced: the doctor interface offers only modules from the consented scope, and the service layer independently verifies</w:t>
       </w:r>
       <w:r>
         <w:t xml:space="preserve"> </w:t>
@@ -30436,7 +30216,7 @@
         </m:sSub>
       </m:oMath>
       <w:r>
-        <w:t xml:space="preserve">) is computed and displayed to the requester, whereas the data-release gate currently requires an ACTIVE consent state, a valid access proof and a valid scope. Routing the release decision through the full matrix is a small planned change that will make the implemented gate identical to Eq. (6).</w:t>
+        <w:t xml:space="preserve">) is computed and displayed to the requester, whereas the data-release gate currently requires an ACTIVE consent state, a valid access proof and a valid scope. Routing the release decision through the full matrix is a small planned change that will make the implemented gate identical to Eq. (24).</w:t>
       </w:r>
     </w:p>
     <w:bookmarkEnd w:id="116"/>
@@ -31160,7 +30940,7 @@
         <w:pStyle w:val="FirstParagraph"/>
       </w:pPr>
       <w:r>
-        <w:t xml:space="preserve">where ⊨ denotes that the requested purpose</w:t>
+        <w:t xml:space="preserve">Here, ⊨ denotes that the requested purpose</w:t>
       </w:r>
       <w:r>
         <w:t xml:space="preserve"> </w:t>
@@ -33661,7 +33441,7 @@
         <w:pStyle w:val="BodyText"/>
       </w:pPr>
       <w:r>
-        <w:t xml:space="preserve">The current stage model evaluates identity, collective authorisation, and policy compliance. RO5 extends this model by introducing temporal validity</w:t>
+        <w:t xml:space="preserve">The current-stage model evaluates identity, collective authorisation, and policy compliance. RO5 extends this model by introducing temporal validity</w:t>
       </w:r>
       <w:r>
         <w:t xml:space="preserve"> </w:t>
@@ -34583,7 +34363,7 @@
         <w:t xml:space="preserve">q</w:t>
       </w:r>
       <w:r>
-        <w:t xml:space="preserve">. Different operations may be permitted only in specific lifecycle states. For example, activation may require a consent to be in a pending state, while data access may require the consent to be active. The state transition condition can be represented as</w:t>
+        <w:t xml:space="preserve">. Different operations may be permitted only in specific lifecycle states. For example, activation may require a consent to be in a pending state, while data access may require the consent to be active. The state-transition condition can be represented as</w:t>
       </w:r>
     </w:p>
     <w:p>
@@ -36098,7 +35878,7 @@
         <w:pStyle w:val="FirstParagraph"/>
       </w:pPr>
       <w:r>
-        <w:t xml:space="preserve">This procedure establishes that consent validity is not a static property. Instead, the validity of consent is a function of both time and lifecycle state that</w:t>
+        <w:t xml:space="preserve">This procedure establishes that consent validity is not a static property. Instead, the validity of consent is a function of both time and lifecycle state:</w:t>
       </w:r>
     </w:p>
     <w:p>
@@ -38263,7 +38043,23 @@
         <w:pStyle w:val="FirstParagraph"/>
       </w:pPr>
       <w:r>
-        <w:t xml:space="preserve">The first step is to define the security and authorisation properties P that the framework is expected to satisfy. These properties provide the formal evaluation criteria against which the observed system behaviour will subsequently be compared.</w:t>
+        <w:t xml:space="preserve">The first step is to define the security and authorisation properties</w:t>
+      </w:r>
+      <w:r>
+        <w:t xml:space="preserve"> </w:t>
+      </w:r>
+      <w:r>
+        <w:rPr>
+          <w:i/>
+          <w:iCs/>
+        </w:rPr>
+        <w:t xml:space="preserve">P</w:t>
+      </w:r>
+      <w:r>
+        <w:t xml:space="preserve"> </w:t>
+      </w:r>
+      <w:r>
+        <w:t xml:space="preserve">that the framework is expected to satisfy. These properties provide the formal evaluation criteria against which the observed system behaviour will subsequently be compared.</w:t>
       </w:r>
     </w:p>
     <w:p>
@@ -38528,7 +38324,17 @@
         <w:pStyle w:val="FirstParagraph"/>
       </w:pPr>
       <w:r>
-        <w:t xml:space="preserve">The system defines a set of valid scenarios S</w:t>
+        <w:t xml:space="preserve">The system defines a set of valid scenarios</w:t>
+      </w:r>
+      <w:r>
+        <w:t xml:space="preserve"> </w:t>
+      </w:r>
+      <w:r>
+        <w:rPr>
+          <w:i/>
+          <w:iCs/>
+        </w:rPr>
+        <w:t xml:space="preserve">S</w:t>
       </w:r>
       <w:r>
         <w:rPr>
@@ -38569,7 +38375,17 @@
         <w:pStyle w:val="FirstParagraph"/>
       </w:pPr>
       <w:r>
-        <w:t xml:space="preserve">The system defines a set of negative scenarios S</w:t>
+        <w:t xml:space="preserve">The system defines a set of negative scenarios</w:t>
+      </w:r>
+      <w:r>
+        <w:t xml:space="preserve"> </w:t>
+      </w:r>
+      <w:r>
+        <w:rPr>
+          <w:i/>
+          <w:iCs/>
+        </w:rPr>
+        <w:t xml:space="preserve">S</w:t>
       </w:r>
       <w:r>
         <w:rPr>
@@ -38602,7 +38418,17 @@
         <w:pStyle w:val="FirstParagraph"/>
       </w:pPr>
       <w:r>
-        <w:t xml:space="preserve">The system defines adversarial scenarios S</w:t>
+        <w:t xml:space="preserve">The system defines adversarial scenarios</w:t>
+      </w:r>
+      <w:r>
+        <w:t xml:space="preserve"> </w:t>
+      </w:r>
+      <w:r>
+        <w:rPr>
+          <w:i/>
+          <w:iCs/>
+        </w:rPr>
+        <w:t xml:space="preserve">S</w:t>
       </w:r>
       <w:r>
         <w:rPr>
@@ -38789,7 +38615,23 @@
         <w:t xml:space="preserve"> </w:t>
       </w:r>
       <w:r>
-        <w:t xml:space="preserve">∈S is associated with an expected authorisation outcome and the security properties that it is intended to evaluate.</w:t>
+        <w:t xml:space="preserve">∈</w:t>
+      </w:r>
+      <w:r>
+        <w:t xml:space="preserve"> </w:t>
+      </w:r>
+      <w:r>
+        <w:rPr>
+          <w:i/>
+          <w:iCs/>
+        </w:rPr>
+        <w:t xml:space="preserve">S</w:t>
+      </w:r>
+      <w:r>
+        <w:t xml:space="preserve"> </w:t>
+      </w:r>
+      <w:r>
+        <w:t xml:space="preserve">is associated with an expected authorisation outcome and the security properties that it is intended to evaluate.</w:t>
       </w:r>
     </w:p>
     <w:p>
@@ -42392,6 +42234,16 @@
       </w:pPr>
       <w:r>
         <w:t xml:space="preserve">The resulting validation methodology provides empirical evidence that the proposed authorisation model is not merely conceptually defined but is operationally enforceable and testable under legitimate, invalid, and adversarial conditions.</w:t>
+      </w:r>
+    </w:p>
+    <w:bookmarkEnd w:id="131"/>
+    <w:bookmarkStart w:id="132" w:name="Xb697f75e4cb43d67a9074b27c380a0731d6d029"/>
+    <w:p>
+      <w:pPr>
+        <w:pStyle w:val="Heading3"/>
+      </w:pPr>
+      <w:r>
+        <w:t xml:space="preserve">6.6.3 Algorithm 6: Formal and Empirical Authorisation Validation</w:t>
       </w:r>
     </w:p>
     <w:p>
@@ -42860,19 +42712,9 @@
         <w:t xml:space="preserve">Validation results</w:t>
       </w:r>
     </w:p>
-    <w:bookmarkEnd w:id="131"/>
-    <w:bookmarkStart w:id="132" w:name="Xb697f75e4cb43d67a9074b27c380a0731d6d029"/>
-    <w:p>
-      <w:pPr>
-        <w:pStyle w:val="Heading3"/>
-      </w:pPr>
-      <w:r>
-        <w:t xml:space="preserve">6.6.3 Algorithm 6: Formal and Empirical Authorisation Validation</w:t>
-      </w:r>
-    </w:p>
-    <w:p>
-      <w:pPr>
-        <w:pStyle w:val="FirstParagraph"/>
+    <w:p>
+      <w:pPr>
+        <w:pStyle w:val="BodyText"/>
       </w:pPr>
       <w:r>
         <w:t xml:space="preserve">Algorithm 6 provides a structured method for evaluating the framework. It does not assume that successful execution of a consent workflow is sufficient evidence of security. Instead, it requires the system to demonstrate that invalid conditions produce appropriate denial decisions and that the recorded evidence is consistent with the decision.</w:t>
@@ -42910,7 +42752,7 @@
         <w:pStyle w:val="BodyText"/>
       </w:pPr>
       <w:r>
-        <w:t xml:space="preserve">The final two algorithms extend this foundational mechanism. Algorithm 5 introduces temporal and lifecycle validity, while Algorithm 6 provides formal and empirical assurance of the complete framework. This structure reflects the staged research design in which current stage establishes the foundational authorisation mechanisms and CA3 investigates their dynamic validity, security assurance, and comprehensive practical effectiveness.</w:t>
+        <w:t xml:space="preserve">The final two algorithms extend this foundational mechanism. Algorithm 5 introduces temporal and lifecycle validity, while Algorithm 6 provides formal and empirical assurance of the complete framework. This structure reflects the staged research design in which the current stage establishes the foundational authorisation mechanisms and CA3 investigates their dynamic validity, security assurance, and comprehensive practical effectiveness.</w:t>
       </w:r>
     </w:p>
     <w:p>
@@ -42918,7 +42760,7 @@
         <w:pStyle w:val="BodyText"/>
       </w:pPr>
       <w:r>
-        <w:t xml:space="preserve">The overall trust-oriented authorisation process can therefore be summarised as Trustworthy Access with 1) Identity and Authority Trust, 2) Collective Authorisation, 3) Policy Compliance, 4) Temporal and Lifecycle Trust. For the current stage implementation, the operational decision is based on Eq. (6).</w:t>
+        <w:t xml:space="preserve">The overall trust-oriented authorisation process can therefore be summarised as Trustworthy Access with 1) Identity and Authority Trust, 2) Collective Authorisation, 3) Policy Compliance, 4) Temporal and Lifecycle Trust. For the current-stage implementation, the operational decision is based on Eq. (6).</w:t>
       </w:r>
     </w:p>
     <w:p>
@@ -42961,7 +42803,7 @@
         <w:pStyle w:val="BodyText"/>
       </w:pPr>
       <w:r>
-        <w:t xml:space="preserve">The overall workflow implemented by the implementation is therefore consistent with the proposed authorisation model as</w:t>
+        <w:t xml:space="preserve">The overall workflow of the implementation is therefore consistent with the proposed authorisation model as</w:t>
       </w:r>
     </w:p>
     <w:p>
@@ -43611,7 +43453,7 @@
         <w:t xml:space="preserve">Guardian Cryptographic Approval</w:t>
       </w:r>
       <w:r>
-        <w:t xml:space="preserve">. As shown in the figure below, operationalises the multi-party authorisation component of the proposed framework.</w:t>
+        <w:t xml:space="preserve">. As shown in the figure below, it operationalises the multi-party authorisation component of the proposed framework.</w:t>
       </w:r>
     </w:p>
     <w:p>
@@ -44262,7 +44104,7 @@
         <w:pStyle w:val="BodyText"/>
       </w:pPr>
       <w:r>
-        <w:t xml:space="preserve">demonstrates the transition from</w:t>
+        <w:t xml:space="preserve">This demonstrates the transition from</w:t>
       </w:r>
       <w:r>
         <w:t xml:space="preserve"> </w:t>
@@ -44354,7 +44196,7 @@
         <w:pStyle w:val="BodyText"/>
       </w:pPr>
       <w:r>
-        <w:t xml:space="preserve">This distinction is central to the HALAH design. Consent and data access are not treated as identical events. Instead, it goes the flow as below</w:t>
+        <w:t xml:space="preserve">This distinction is central to the HALAH design. Consent and data access are not treated as identical events. Instead, the flow goes as below</w:t>
       </w:r>
     </w:p>
     <w:p>
@@ -45077,6 +44919,9 @@
           <m:t>D</m:t>
         </m:r>
       </m:oMath>
+      <w:r>
+        <w:t xml:space="preserve">.</w:t>
+      </w:r>
     </w:p>
     <w:p>
       <w:pPr>
@@ -45475,18 +45320,6 @@
         <w:t xml:space="preserve">.</w:t>
       </w:r>
     </w:p>
-    <w:p>
-      <w:pPr>
-        <w:pStyle w:val="BodyText"/>
-      </w:pPr>
-      <w:r>
-        <w:rPr>
-          <w:b/>
-          <w:bCs/>
-        </w:rPr>
-        <w:t xml:space="preserve">CA 3 Discussion</w:t>
-      </w:r>
-    </w:p>
     <w:bookmarkEnd w:id="156"/>
     <w:bookmarkStart w:id="157" w:name="complete-blockchain-audit-ledger"/>
     <w:p>
@@ -45820,7 +45653,7 @@
               <w:jc w:val="left"/>
             </w:pPr>
             <w:r>
-              <w:t xml:space="preserve">Multi-party Consent</w:t>
+              <w:t xml:space="preserve">Multi-Party Consent</w:t>
             </w:r>
           </w:p>
         </w:tc>
@@ -46243,6 +46076,168 @@
     <w:p>
       <w:pPr>
         <w:pStyle w:val="BodyText"/>
+      </w:pPr>
+      <m:oMathPara>
+        <m:oMathParaPr>
+          <m:jc m:val="center"/>
+        </m:oMathParaPr>
+        <m:oMath>
+          <m:r>
+            <m:t>C</m:t>
+          </m:r>
+          <m:r>
+            <m:rPr>
+              <m:sty m:val="p"/>
+            </m:rPr>
+            <m:t>→</m:t>
+          </m:r>
+          <m:r>
+            <m:t>M</m:t>
+          </m:r>
+          <m:r>
+            <m:t>S</m:t>
+          </m:r>
+          <m:r>
+            <m:rPr>
+              <m:sty m:val="p"/>
+            </m:rPr>
+            <m:t>→</m:t>
+          </m:r>
+          <m:r>
+            <m:t>S</m:t>
+          </m:r>
+          <m:r>
+            <m:t>B</m:t>
+          </m:r>
+          <m:r>
+            <m:t>T</m:t>
+          </m:r>
+          <m:r>
+            <m:rPr>
+              <m:sty m:val="p"/>
+            </m:rPr>
+            <m:t>→</m:t>
+          </m:r>
+          <m:r>
+            <m:t>S</m:t>
+          </m:r>
+          <m:r>
+            <m:t>t</m:t>
+          </m:r>
+          <m:r>
+            <m:t>a</m:t>
+          </m:r>
+          <m:r>
+            <m:t>t</m:t>
+          </m:r>
+          <m:r>
+            <m:t>e</m:t>
+          </m:r>
+          <m:r>
+            <m:t>C</m:t>
+          </m:r>
+          <m:r>
+            <m:t>h</m:t>
+          </m:r>
+          <m:r>
+            <m:t>e</m:t>
+          </m:r>
+          <m:r>
+            <m:t>c</m:t>
+          </m:r>
+          <m:r>
+            <m:t>k</m:t>
+          </m:r>
+          <m:r>
+            <m:rPr>
+              <m:sty m:val="p"/>
+            </m:rPr>
+            <m:t>→</m:t>
+          </m:r>
+          <m:r>
+            <m:t>A</m:t>
+          </m:r>
+          <m:r>
+            <m:t>c</m:t>
+          </m:r>
+          <m:r>
+            <m:t>c</m:t>
+          </m:r>
+          <m:r>
+            <m:t>e</m:t>
+          </m:r>
+          <m:r>
+            <m:t>s</m:t>
+          </m:r>
+          <m:r>
+            <m:t>s</m:t>
+          </m:r>
+          <m:r>
+            <m:t>D</m:t>
+          </m:r>
+          <m:r>
+            <m:t>e</m:t>
+          </m:r>
+          <m:r>
+            <m:t>c</m:t>
+          </m:r>
+          <m:r>
+            <m:t>i</m:t>
+          </m:r>
+          <m:r>
+            <m:t>s</m:t>
+          </m:r>
+          <m:r>
+            <m:t>i</m:t>
+          </m:r>
+          <m:r>
+            <m:t>o</m:t>
+          </m:r>
+          <m:r>
+            <m:t>n</m:t>
+          </m:r>
+          <m:r>
+            <m:rPr>
+              <m:sty m:val="p"/>
+            </m:rPr>
+            <m:t>→</m:t>
+          </m:r>
+          <m:r>
+            <m:t>E</m:t>
+          </m:r>
+          <m:r>
+            <m:t>M</m:t>
+          </m:r>
+          <m:r>
+            <m:t>R</m:t>
+          </m:r>
+          <m:r>
+            <m:rPr>
+              <m:sty m:val="p"/>
+            </m:rPr>
+            <m:t>→</m:t>
+          </m:r>
+          <m:r>
+            <m:t>A</m:t>
+          </m:r>
+          <m:r>
+            <m:t>u</m:t>
+          </m:r>
+          <m:r>
+            <m:t>d</m:t>
+          </m:r>
+          <m:r>
+            <m:t>i</m:t>
+          </m:r>
+          <m:r>
+            <m:t>t</m:t>
+          </m:r>
+        </m:oMath>
+      </m:oMathPara>
+    </w:p>
+    <w:p>
+      <w:pPr>
+        <w:pStyle w:val="FirstParagraph"/>
       </w:pPr>
       <w:r>
         <w:t xml:space="preserve">where</w:t>
@@ -49097,7 +49092,7 @@
         <w:pStyle w:val="BodyText"/>
       </w:pPr>
       <w:r>
-        <w:t xml:space="preserve">The expected outcome is a lifecycle-aware consent mechanism capable of rejecting access after expiration or revocation and preventing unauthorised lifecycle transitions. This work will constitute a major component of next stage.</w:t>
+        <w:t xml:space="preserve">The expected outcome is a lifecycle-aware consent mechanism capable of rejecting access after expiration or revocation and preventing unauthorised lifecycle transitions. This work will constitute a major component of the next stage.</w:t>
       </w:r>
     </w:p>
     <w:bookmarkEnd w:id="172"/>
@@ -49159,7 +49154,7 @@
         <w:pStyle w:val="BodyText"/>
       </w:pPr>
       <w:r>
-        <w:t xml:space="preserve">The remaining security assurance and comprehensive empirical evaluation will be conducted in next stage. These activities will include policy-violation scenarios, temporal expiration, revocation, invalid lifecycle transitions, formal security properties, and broader experimental validation.</w:t>
+        <w:t xml:space="preserve">The remaining security assurance and comprehensive empirical evaluation will be conducted in the next stage. These activities will include policy-violation scenarios, temporal expiration, revocation, invalid lifecycle transitions, formal security properties, and broader experimental validation.</w:t>
       </w:r>
     </w:p>
     <w:bookmarkEnd w:id="173"/>
@@ -49199,8 +49194,8 @@
       </w:tblPr>
       <w:tblGrid>
         <w:gridCol w:w="2207"/>
-        <w:gridCol w:w="1341"/>
-        <w:gridCol w:w="2163"/>
+        <w:gridCol w:w="1384"/>
+        <w:gridCol w:w="2120"/>
         <w:gridCol w:w="2207"/>
       </w:tblGrid>
       <w:tr>
@@ -49359,7 +49354,7 @@
               <w:jc w:val="left"/>
             </w:pPr>
             <w:r>
-              <w:t xml:space="preserve">Core architectural contribution; addresses SRQ1-RQ4 (Chapters 3-4).</w:t>
+              <w:t xml:space="preserve">Core architectural contribution; addresses SRQ1–SRQ4 (Chapters 3–4).</w:t>
             </w:r>
           </w:p>
         </w:tc>
@@ -49522,7 +49517,7 @@
         <w:pStyle w:val="FirstParagraph"/>
       </w:pPr>
       <w:r>
-        <w:t xml:space="preserve">The research plan is divided into two major stages corresponding to current and next stage.</w:t>
+        <w:t xml:space="preserve">The research plan is divided into two major stages corresponding to the current and next stages.</w:t>
       </w:r>
     </w:p>
     <w:bookmarkStart w:id="176" w:name="current-stage-completed-and-current-work"/>
@@ -49565,7 +49560,7 @@
         <w:pStyle w:val="FirstParagraph"/>
       </w:pPr>
       <w:r>
-        <w:t xml:space="preserve">The next stage will build upon the foundational trust-oriented authorisation framework established during the current stage and extend the research towards dynamic consent governance, formal security assurance, and comprehensive empirical validation. While current stage focuses on establishing the core mechanisms required to construct a trustworthy authorisation decision, next stage will investigate whether this trust can be maintained over time, formally justified, and reliably demonstrated in practical healthcare data-sharing scenarios.</w:t>
+        <w:t xml:space="preserve">The next stage will build upon the foundational trust-oriented authorisation framework established during the current stage and extend the research towards dynamic consent governance, formal security assurance, and comprehensive empirical validation. While the current stage focuses on establishing the core mechanisms required to construct a trustworthy authorisation decision, the next stage will investigate whether this trust can be maintained over time, formally justified, and reliably demonstrated in practical healthcare data-sharing scenarios.</w:t>
       </w:r>
     </w:p>
     <w:p>
@@ -49573,7 +49568,7 @@
         <w:pStyle w:val="BodyText"/>
       </w:pPr>
       <w:r>
-        <w:t xml:space="preserve">The first major focus of next stage is the introduction of</w:t>
+        <w:t xml:space="preserve">The first major focus of the next stage is the introduction of</w:t>
       </w:r>
       <w:r>
         <w:t xml:space="preserve"> </w:t>
@@ -49586,7 +49581,7 @@
         <w:t xml:space="preserve">temporal and lifecycle trust</w:t>
       </w:r>
       <w:r>
-        <w:t xml:space="preserve">. In the current framework, identity, multi-party approval, and policy compliance provide the principal conditions for an authorisation decision. However, authorisation is not necessarily permanent. A consent decision may become invalid because its validity period has expired, because the patient or an authorised participant has revoked the consent, or because the consent has transitioned into a state in which access should no longer be permitted. Next stage will therefore extend the consent model to explicitly represent temporal constraints and controlled lifecycle transitions. This extension will allow the framework to distinguish between a consent that was previously valid and a consent that remains valid at the time of a particular access request.</w:t>
+        <w:t xml:space="preserve">. In the current framework, identity, multi-party approval, and policy compliance provide the principal conditions for an authorisation decision. However, authorisation is not necessarily permanent. A consent decision may become invalid because its validity period has expired, because the patient or an authorised participant has revoked the consent, or because the consent has transitioned into a state in which access should no longer be permitted. The next stage will therefore extend the consent model to explicitly represent temporal constraints and controlled lifecycle transitions. This extension will allow the framework to distinguish between a consent that was previously valid and a consent that remains valid at the time of a particular access request.</w:t>
       </w:r>
     </w:p>
     <w:p>
@@ -49628,7 +49623,7 @@
         <w:t xml:space="preserve">comprehensive empirical validation</w:t>
       </w:r>
       <w:r>
-        <w:t xml:space="preserve">. The HALAH prototype provides the experimental environment for evaluating the proposed framework using synthetic healthcare data and representative multi-party consent scenarios. Next stage will extend the current prototype-based evaluation to include both successful and adversarial access requests. The experiments will examine whether the implementation consistently produces an</w:t>
+        <w:t xml:space="preserve">. The HALAH prototype provides the experimental environment for evaluating the proposed framework using synthetic healthcare data and representative multi-party consent scenarios. The next stage will extend the current prototype-based evaluation to include both successful and adversarial access requests. The experiments will examine whether the implementation consistently produces an</w:t>
       </w:r>
       <w:r>
         <w:t xml:space="preserve"> </w:t>
@@ -49668,7 +49663,7 @@
         <w:pStyle w:val="BodyText"/>
       </w:pPr>
       <w:r>
-        <w:t xml:space="preserve">An important analytical objective of next stage is to examine the relationship between the different forms of trust established throughout the framework. Temporal validity, for example, should not be treated as an independent access-control feature. Instead, it should act as an additional condition on an already established authorisation relationship. Similarly, revocation should invalidate a previously established consent rather than merely create a new record indicating that the consent has changed. This perspective allows the research to investigate trust as a dynamic property rather than as a one-time outcome of authentication or approval.</w:t>
+        <w:t xml:space="preserve">An important analytical objective of the next stage is to examine the relationship between the different forms of trust established throughout the framework. Temporal validity, for example, should not be treated as an independent access-control feature. Instead, it should act as an additional condition on an already established authorisation relationship. Similarly, revocation should invalidate a previously established consent rather than merely create a new record indicating that the consent has changed. This perspective allows the research to investigate trust as a dynamic property rather than as a one-time outcome of authentication or approval.</w:t>
       </w:r>
     </w:p>
     <w:p>
@@ -49974,7 +49969,7 @@
         <w:pStyle w:val="BodyText"/>
       </w:pPr>
       <w:r>
-        <w:t xml:space="preserve">The complete authorisation model developed across current stage and next stage will therefore be evaluated as a conjunction of independently verifiable conditions. Conceptually, the final decision can be expressed as</w:t>
+        <w:t xml:space="preserve">The complete authorisation model developed across the current stage and the next stage will therefore be evaluated as a conjunction of independently verifiable conditions. Conceptually, the final decision can be expressed as</w:t>
       </w:r>
     </w:p>
     <w:p>
@@ -50139,7 +50134,7 @@
         <w:pStyle w:val="BodyText"/>
       </w:pPr>
       <w:r>
-        <w:t xml:space="preserve">By the completion of next stage, the research is expected to provide three complementary forms of contribution. First, the research will provide a conceptual Trust Computing model that explains how trustworthy multi-party consent can be established and maintained. Second, it will provide a technical implementation through the HALAH prototype demonstrating how the proposed trust conditions can be enforced in a decentralised healthcare environment. Third, it will provide formal and empirical evidence concerning the security and practical effectiveness of the proposed framework.</w:t>
+        <w:t xml:space="preserve">By the completion of the next stage, the research is expected to provide three complementary forms of contribution. First, the research will provide a conceptual Trust Computing model that explains how trustworthy multi-party consent can be established and maintained. Second, it will provide a technical implementation through the HALAH prototype demonstrating how the proposed trust conditions can be enforced in a decentralised healthcare environment. Third, it will provide formal and empirical evidence concerning the security and practical effectiveness of the proposed framework.</w:t>
       </w:r>
     </w:p>
     <w:p>
@@ -50147,7 +50142,7 @@
         <w:pStyle w:val="BodyText"/>
       </w:pPr>
       <w:r>
-        <w:t xml:space="preserve">Consequently, next stage will complete the transition from the foundational authorisation mechanisms established in current stage to a dynamically managed, formally reasoned, and empirically validated Trust Computing framework. The final contribution will be assessed not simply by whether consent can be recorded or whether access can be granted, but by whether the system can provide a defensible basis for determining</w:t>
+        <w:t xml:space="preserve">Consequently, the next stage will complete the transition from the foundational authorisation mechanisms established in the current stage to a dynamically managed, formally reasoned, and empirically validated Trust Computing framework. The final contribution will be assessed not simply by whether consent can be recorded or whether access can be granted, but by whether the system can provide a defensible basis for determining</w:t>
       </w:r>
       <w:r>
         <w:t xml:space="preserve"> </w:t>
@@ -50198,7 +50193,7 @@
         <w:pStyle w:val="FirstParagraph"/>
       </w:pPr>
       <w:r>
-        <w:t xml:space="preserve">[1] Abdul Ghafoor Abbasi, Iraklis Symeonidis, Anna Rydberg, Cecilia Lindahl, and Abdul Qadus Abbasi. Towards empowering stakeholders through decentralized trust and secure live-stock data sharing.</w:t>
+        <w:t xml:space="preserve">[1] Abdul Ghafoor Abbasi, Iraklis Symeonidis, Anna Rydberg, Cecilia Lindahl, and Abdul Qadus Abbasi. Towards empowering stakeholders through decentralized trust and secure livestock data sharing.</w:t>
       </w:r>
       <w:r>
         <w:t xml:space="preserve"> </w:t>
@@ -50513,7 +50508,7 @@
         <w:pStyle w:val="BodyText"/>
       </w:pPr>
       <w:r>
-        <w:t xml:space="preserve">[16] Alexander Kharlamov, Roland Hohmann, and Glann Parry. Data sharing decisions: perceptions and intentions in healthcare.</w:t>
+        <w:t xml:space="preserve">[16] Alexander Kharlamov, Roland Hohmann, and Glenn Parry. Data sharing decisions: perceptions and intentions in healthcare.</w:t>
       </w:r>
       <w:r>
         <w:t xml:space="preserve"> </w:t>
@@ -50610,7 +50605,7 @@
         <w:t xml:space="preserve">IEEE Communications Surveys &amp; Tutorials</w:t>
       </w:r>
       <w:r>
-        <w:t xml:space="preserve">, 27(6):3641–3671,2025.</w:t>
+        <w:t xml:space="preserve">, 27(6):3641–3671, 2025.</w:t>
       </w:r>
     </w:p>
     <w:p>
@@ -50733,7 +50728,7 @@
           <w:i/>
           <w:iCs/>
         </w:rPr>
-        <w:t xml:space="preserve">ACM Transactions on Management Information Systems (TMIS)</w:t>
+        <w:t xml:space="preserve">ACM Transactions on Management Information Systems</w:t>
       </w:r>
       <w:r>
         <w:t xml:space="preserve">, 13(4):1–21, 2022.</w:t>
@@ -55850,6 +55845,37 @@
       <w:color w:val="D6008A"/>
     </w:rPr>
   </w:style>
+  <w:style w:customStyle="1" w:styleId="OrangeDelete" w:type="character">
+    <w:name w:val="Orange Delete"/>
+    <w:rPr>
+      <w:strike/>
+      <w:color w:val="E36C09"/>
+    </w:rPr>
+  </w:style>
+  <w:style w:customStyle="1" w:styleId="OrangeFix" w:type="character">
+    <w:name w:val="Orange Fix"/>
+    <w:rPr>
+      <w:color w:val="E36C09"/>
+    </w:rPr>
+  </w:style>
+  <w:style w:customStyle="1" w:styleId="OrangeDeletePara" w:type="paragraph">
+    <w:name w:val="Orange Delete Para"/>
+    <w:basedOn w:val="BodyText"/>
+    <w:rPr>
+      <w:rFonts w:ascii="Times New Roman" w:cs="Times New Roman" w:eastAsia="Times New Roman" w:hAnsi="Times New Roman"/>
+      <w:color w:val="E36C09"/>
+      <w:sz w:val="24"/>
+    </w:rPr>
+  </w:style>
+  <w:style w:customStyle="1" w:styleId="OrangeFixPara" w:type="paragraph">
+    <w:name w:val="Orange Fix Para"/>
+    <w:basedOn w:val="BodyText"/>
+    <w:rPr>
+      <w:rFonts w:ascii="Times New Roman" w:cs="Times New Roman" w:eastAsia="Times New Roman" w:hAnsi="Times New Roman"/>
+      <w:color w:val="E36C09"/>
+      <w:sz w:val="24"/>
+    </w:rPr>
+  </w:style>
   <w:style w:customStyle="1" w:styleId="PinkDeletePara" w:type="paragraph">
     <w:name w:val="Pink Delete Para"/>
     <w:basedOn w:val="BodyText"/>

</xml_diff>